<commit_message>
fix(table): decompose sensitivity costs — sacrifice vs export closure
Sacrifice cost is the TRUE variable: $0.02M (D3) → $87.5M (D30) → $54B (none)
Export closure is a FIXED $1,230M constant once I₀=1 is declared.
Previous table hid this behind a single 'Costo Total' column.
</commit_message>
<xml_diff>
--- a/docs/Segundo_avance/Ganado_Saludable_Segundo_Avance.docx
+++ b/docs/Segundo_avance/Ganado_Saludable_Segundo_Avance.docx
@@ -9250,16 +9250,18 @@
         </w:tblBorders>
       </w:tblPr>
       <w:tblGrid>
-        <w:gridCol w:w="1800"/>
         <w:gridCol w:w="1400"/>
-        <w:gridCol w:w="1800"/>
-        <w:gridCol w:w="1600"/>
-        <w:gridCol w:w="2426"/>
+        <w:gridCol w:w="900"/>
+        <w:gridCol w:w="1200"/>
+        <w:gridCol w:w="1200"/>
+        <w:gridCol w:w="1100"/>
+        <w:gridCol w:w="1100"/>
+        <w:gridCol w:w="2126"/>
       </w:tblGrid>
       <w:tr>
         <w:tc>
           <w:tcPr>
-            <w:tcW w:type="dxa" w:w="1800"/>
+            <w:tcW w:type="dxa" w:w="1400"/>
             <w:tcBorders>
               <w:top w:val="single" w:color="CCCCCC" w:sz="1"/>
               <w:left w:val="single" w:color="CCCCCC" w:sz="1"/>
@@ -9293,7 +9295,7 @@
         </w:tc>
         <w:tc>
           <w:tcPr>
-            <w:tcW w:type="dxa" w:w="1400"/>
+            <w:tcW w:type="dxa" w:w="900"/>
             <w:tcBorders>
               <w:top w:val="single" w:color="CCCCCC" w:sz="1"/>
               <w:left w:val="single" w:color="CCCCCC" w:sz="1"/>
@@ -9321,13 +9323,13 @@
                 <w:sz w:val="20"/>
                 <w:szCs w:val="20"/>
               </w:rPr>
-              <w:t xml:space="preserve">Día de Detección</w:t>
-            </w:r>
-          </w:p>
-        </w:tc>
-        <w:tc>
-          <w:tcPr>
-            <w:tcW w:type="dxa" w:w="1800"/>
+              <w:t xml:space="preserve">Día</w:t>
+            </w:r>
+          </w:p>
+        </w:tc>
+        <w:tc>
+          <w:tcPr>
+            <w:tcW w:type="dxa" w:w="1200"/>
             <w:tcBorders>
               <w:top w:val="single" w:color="CCCCCC" w:sz="1"/>
               <w:left w:val="single" w:color="CCCCCC" w:sz="1"/>
@@ -9355,13 +9357,13 @@
                 <w:sz w:val="20"/>
                 <w:szCs w:val="20"/>
               </w:rPr>
-              <w:t xml:space="preserve">Animales Sacrificados</w:t>
-            </w:r>
-          </w:p>
-        </w:tc>
-        <w:tc>
-          <w:tcPr>
-            <w:tcW w:type="dxa" w:w="1600"/>
+              <w:t xml:space="preserve">Sacrificados</w:t>
+            </w:r>
+          </w:p>
+        </w:tc>
+        <w:tc>
+          <w:tcPr>
+            <w:tcW w:type="dxa" w:w="1200"/>
             <w:tcBorders>
               <w:top w:val="single" w:color="CCCCCC" w:sz="1"/>
               <w:left w:val="single" w:color="CCCCCC" w:sz="1"/>
@@ -9389,13 +9391,13 @@
                 <w:sz w:val="20"/>
                 <w:szCs w:val="20"/>
               </w:rPr>
-              <w:t xml:space="preserve">Costo Total (USD)</w:t>
-            </w:r>
-          </w:p>
-        </w:tc>
-        <w:tc>
-          <w:tcPr>
-            <w:tcW w:type="dxa" w:w="2426"/>
+              <w:t xml:space="preserve">Costo Sacrificio</w:t>
+            </w:r>
+          </w:p>
+        </w:tc>
+        <w:tc>
+          <w:tcPr>
+            <w:tcW w:type="dxa" w:w="1100"/>
             <w:tcBorders>
               <w:top w:val="single" w:color="CCCCCC" w:sz="1"/>
               <w:left w:val="single" w:color="CCCCCC" w:sz="1"/>
@@ -9423,6 +9425,74 @@
                 <w:sz w:val="20"/>
                 <w:szCs w:val="20"/>
               </w:rPr>
+              <w:t xml:space="preserve">Cierre Export.</w:t>
+            </w:r>
+          </w:p>
+        </w:tc>
+        <w:tc>
+          <w:tcPr>
+            <w:tcW w:type="dxa" w:w="1100"/>
+            <w:tcBorders>
+              <w:top w:val="single" w:color="CCCCCC" w:sz="1"/>
+              <w:left w:val="single" w:color="CCCCCC" w:sz="1"/>
+              <w:bottom w:val="single" w:color="CCCCCC" w:sz="1"/>
+              <w:right w:val="single" w:color="CCCCCC" w:sz="1"/>
+            </w:tcBorders>
+            <w:shd w:fill="9C223F" w:val="clear"/>
+            <w:tcMar>
+              <w:top w:type="dxa" w:w="80"/>
+              <w:left w:type="dxa" w:w="120"/>
+              <w:bottom w:type="dxa" w:w="80"/>
+              <w:right w:type="dxa" w:w="120"/>
+            </w:tcMar>
+          </w:tcPr>
+          <w:p>
+            <w:pPr>
+              <w:jc w:val="center"/>
+            </w:pPr>
+            <w:r>
+              <w:rPr>
+                <w:rFonts w:ascii="Arial" w:cs="Arial" w:eastAsia="Arial" w:hAnsi="Arial"/>
+                <w:b/>
+                <w:bCs/>
+                <w:color w:val="FFFFFF"/>
+                <w:sz w:val="20"/>
+                <w:szCs w:val="20"/>
+              </w:rPr>
+              <w:t xml:space="preserve">Costo Total</w:t>
+            </w:r>
+          </w:p>
+        </w:tc>
+        <w:tc>
+          <w:tcPr>
+            <w:tcW w:type="dxa" w:w="2126"/>
+            <w:tcBorders>
+              <w:top w:val="single" w:color="CCCCCC" w:sz="1"/>
+              <w:left w:val="single" w:color="CCCCCC" w:sz="1"/>
+              <w:bottom w:val="single" w:color="CCCCCC" w:sz="1"/>
+              <w:right w:val="single" w:color="CCCCCC" w:sz="1"/>
+            </w:tcBorders>
+            <w:shd w:fill="9C223F" w:val="clear"/>
+            <w:tcMar>
+              <w:top w:type="dxa" w:w="80"/>
+              <w:left w:type="dxa" w:w="120"/>
+              <w:bottom w:type="dxa" w:w="80"/>
+              <w:right w:type="dxa" w:w="120"/>
+            </w:tcMar>
+          </w:tcPr>
+          <w:p>
+            <w:pPr>
+              <w:jc w:val="center"/>
+            </w:pPr>
+            <w:r>
+              <w:rPr>
+                <w:rFonts w:ascii="Arial" w:cs="Arial" w:eastAsia="Arial" w:hAnsi="Arial"/>
+                <w:b/>
+                <w:bCs/>
+                <w:color w:val="FFFFFF"/>
+                <w:sz w:val="20"/>
+                <w:szCs w:val="20"/>
+              </w:rPr>
               <w:t xml:space="preserve">Ahorro vs. sin detección</w:t>
             </w:r>
           </w:p>
@@ -9431,7 +9501,7 @@
       <w:tr>
         <w:tc>
           <w:tcPr>
-            <w:tcW w:type="dxa" w:w="1800"/>
+            <w:tcW w:type="dxa" w:w="1400"/>
             <w:tcBorders>
               <w:top w:val="single" w:color="CCCCCC" w:sz="1"/>
               <w:left w:val="single" w:color="CCCCCC" w:sz="1"/>
@@ -9459,7 +9529,7 @@
         </w:tc>
         <w:tc>
           <w:tcPr>
-            <w:tcW w:type="dxa" w:w="1400"/>
+            <w:tcW w:type="dxa" w:w="900"/>
             <w:tcBorders>
               <w:top w:val="single" w:color="CCCCCC" w:sz="1"/>
               <w:left w:val="single" w:color="CCCCCC" w:sz="1"/>
@@ -9487,7 +9557,7 @@
         </w:tc>
         <w:tc>
           <w:tcPr>
-            <w:tcW w:type="dxa" w:w="1800"/>
+            <w:tcW w:type="dxa" w:w="1200"/>
             <w:tcBorders>
               <w:top w:val="single" w:color="CCCCCC" w:sz="1"/>
               <w:left w:val="single" w:color="CCCCCC" w:sz="1"/>
@@ -9515,7 +9585,35 @@
         </w:tc>
         <w:tc>
           <w:tcPr>
-            <w:tcW w:type="dxa" w:w="1600"/>
+            <w:tcW w:type="dxa" w:w="1200"/>
+            <w:tcBorders>
+              <w:top w:val="single" w:color="CCCCCC" w:sz="1"/>
+              <w:left w:val="single" w:color="CCCCCC" w:sz="1"/>
+              <w:bottom w:val="single" w:color="CCCCCC" w:sz="1"/>
+              <w:right w:val="single" w:color="CCCCCC" w:sz="1"/>
+            </w:tcBorders>
+            <w:shd w:fill="F8F4F0" w:val="clear"/>
+            <w:tcMar>
+              <w:top w:type="dxa" w:w="80"/>
+              <w:left w:type="dxa" w:w="120"/>
+              <w:bottom w:type="dxa" w:w="80"/>
+              <w:right w:type="dxa" w:w="120"/>
+            </w:tcMar>
+          </w:tcPr>
+          <w:p>
+            <w:r>
+              <w:rPr>
+                <w:rFonts w:ascii="Arial" w:cs="Arial" w:eastAsia="Arial" w:hAnsi="Arial"/>
+                <w:sz w:val="20"/>
+                <w:szCs w:val="20"/>
+              </w:rPr>
+              <w:t xml:space="preserve">$0.02M</w:t>
+            </w:r>
+          </w:p>
+        </w:tc>
+        <w:tc>
+          <w:tcPr>
+            <w:tcW w:type="dxa" w:w="1100"/>
             <w:tcBorders>
               <w:top w:val="single" w:color="CCCCCC" w:sz="1"/>
               <w:left w:val="single" w:color="CCCCCC" w:sz="1"/>
@@ -9543,7 +9641,35 @@
         </w:tc>
         <w:tc>
           <w:tcPr>
-            <w:tcW w:type="dxa" w:w="2426"/>
+            <w:tcW w:type="dxa" w:w="1100"/>
+            <w:tcBorders>
+              <w:top w:val="single" w:color="CCCCCC" w:sz="1"/>
+              <w:left w:val="single" w:color="CCCCCC" w:sz="1"/>
+              <w:bottom w:val="single" w:color="CCCCCC" w:sz="1"/>
+              <w:right w:val="single" w:color="CCCCCC" w:sz="1"/>
+            </w:tcBorders>
+            <w:shd w:fill="F8F4F0" w:val="clear"/>
+            <w:tcMar>
+              <w:top w:type="dxa" w:w="80"/>
+              <w:left w:type="dxa" w:w="120"/>
+              <w:bottom w:type="dxa" w:w="80"/>
+              <w:right w:type="dxa" w:w="120"/>
+            </w:tcMar>
+          </w:tcPr>
+          <w:p>
+            <w:r>
+              <w:rPr>
+                <w:rFonts w:ascii="Arial" w:cs="Arial" w:eastAsia="Arial" w:hAnsi="Arial"/>
+                <w:sz w:val="20"/>
+                <w:szCs w:val="20"/>
+              </w:rPr>
+              <w:t xml:space="preserve">$1,230M</w:t>
+            </w:r>
+          </w:p>
+        </w:tc>
+        <w:tc>
+          <w:tcPr>
+            <w:tcW w:type="dxa" w:w="2126"/>
             <w:tcBorders>
               <w:top w:val="single" w:color="CCCCCC" w:sz="1"/>
               <w:left w:val="single" w:color="CCCCCC" w:sz="1"/>
@@ -9573,7 +9699,7 @@
       <w:tr>
         <w:tc>
           <w:tcPr>
-            <w:tcW w:type="dxa" w:w="1800"/>
+            <w:tcW w:type="dxa" w:w="1400"/>
             <w:tcBorders>
               <w:top w:val="single" w:color="CCCCCC" w:sz="1"/>
               <w:left w:val="single" w:color="CCCCCC" w:sz="1"/>
@@ -9601,7 +9727,7 @@
         </w:tc>
         <w:tc>
           <w:tcPr>
-            <w:tcW w:type="dxa" w:w="1400"/>
+            <w:tcW w:type="dxa" w:w="900"/>
             <w:tcBorders>
               <w:top w:val="single" w:color="CCCCCC" w:sz="1"/>
               <w:left w:val="single" w:color="CCCCCC" w:sz="1"/>
@@ -9629,7 +9755,7 @@
         </w:tc>
         <w:tc>
           <w:tcPr>
-            <w:tcW w:type="dxa" w:w="1800"/>
+            <w:tcW w:type="dxa" w:w="1200"/>
             <w:tcBorders>
               <w:top w:val="single" w:color="CCCCCC" w:sz="1"/>
               <w:left w:val="single" w:color="CCCCCC" w:sz="1"/>
@@ -9657,7 +9783,7 @@
         </w:tc>
         <w:tc>
           <w:tcPr>
-            <w:tcW w:type="dxa" w:w="1600"/>
+            <w:tcW w:type="dxa" w:w="1200"/>
             <w:tcBorders>
               <w:top w:val="single" w:color="CCCCCC" w:sz="1"/>
               <w:left w:val="single" w:color="CCCCCC" w:sz="1"/>
@@ -9679,13 +9805,69 @@
                 <w:sz w:val="20"/>
                 <w:szCs w:val="20"/>
               </w:rPr>
+              <w:t xml:space="preserve">$0.71M</w:t>
+            </w:r>
+          </w:p>
+        </w:tc>
+        <w:tc>
+          <w:tcPr>
+            <w:tcW w:type="dxa" w:w="1100"/>
+            <w:tcBorders>
+              <w:top w:val="single" w:color="CCCCCC" w:sz="1"/>
+              <w:left w:val="single" w:color="CCCCCC" w:sz="1"/>
+              <w:bottom w:val="single" w:color="CCCCCC" w:sz="1"/>
+              <w:right w:val="single" w:color="CCCCCC" w:sz="1"/>
+            </w:tcBorders>
+            <w:shd w:fill="FFFFFF" w:val="clear"/>
+            <w:tcMar>
+              <w:top w:type="dxa" w:w="80"/>
+              <w:left w:type="dxa" w:w="120"/>
+              <w:bottom w:type="dxa" w:w="80"/>
+              <w:right w:type="dxa" w:w="120"/>
+            </w:tcMar>
+          </w:tcPr>
+          <w:p>
+            <w:r>
+              <w:rPr>
+                <w:rFonts w:ascii="Arial" w:cs="Arial" w:eastAsia="Arial" w:hAnsi="Arial"/>
+                <w:sz w:val="20"/>
+                <w:szCs w:val="20"/>
+              </w:rPr>
+              <w:t xml:space="preserve">$1,230M</w:t>
+            </w:r>
+          </w:p>
+        </w:tc>
+        <w:tc>
+          <w:tcPr>
+            <w:tcW w:type="dxa" w:w="1100"/>
+            <w:tcBorders>
+              <w:top w:val="single" w:color="CCCCCC" w:sz="1"/>
+              <w:left w:val="single" w:color="CCCCCC" w:sz="1"/>
+              <w:bottom w:val="single" w:color="CCCCCC" w:sz="1"/>
+              <w:right w:val="single" w:color="CCCCCC" w:sz="1"/>
+            </w:tcBorders>
+            <w:shd w:fill="FFFFFF" w:val="clear"/>
+            <w:tcMar>
+              <w:top w:type="dxa" w:w="80"/>
+              <w:left w:type="dxa" w:w="120"/>
+              <w:bottom w:type="dxa" w:w="80"/>
+              <w:right w:type="dxa" w:w="120"/>
+            </w:tcMar>
+          </w:tcPr>
+          <w:p>
+            <w:r>
+              <w:rPr>
+                <w:rFonts w:ascii="Arial" w:cs="Arial" w:eastAsia="Arial" w:hAnsi="Arial"/>
+                <w:sz w:val="20"/>
+                <w:szCs w:val="20"/>
+              </w:rPr>
               <w:t xml:space="preserve">$1,231M</w:t>
             </w:r>
           </w:p>
         </w:tc>
         <w:tc>
           <w:tcPr>
-            <w:tcW w:type="dxa" w:w="2426"/>
+            <w:tcW w:type="dxa" w:w="2126"/>
             <w:tcBorders>
               <w:top w:val="single" w:color="CCCCCC" w:sz="1"/>
               <w:left w:val="single" w:color="CCCCCC" w:sz="1"/>
@@ -9715,7 +9897,7 @@
       <w:tr>
         <w:tc>
           <w:tcPr>
-            <w:tcW w:type="dxa" w:w="1800"/>
+            <w:tcW w:type="dxa" w:w="1400"/>
             <w:tcBorders>
               <w:top w:val="single" w:color="CCCCCC" w:sz="1"/>
               <w:left w:val="single" w:color="CCCCCC" w:sz="1"/>
@@ -9743,7 +9925,7 @@
         </w:tc>
         <w:tc>
           <w:tcPr>
-            <w:tcW w:type="dxa" w:w="1400"/>
+            <w:tcW w:type="dxa" w:w="900"/>
             <w:tcBorders>
               <w:top w:val="single" w:color="CCCCCC" w:sz="1"/>
               <w:left w:val="single" w:color="CCCCCC" w:sz="1"/>
@@ -9771,7 +9953,7 @@
         </w:tc>
         <w:tc>
           <w:tcPr>
-            <w:tcW w:type="dxa" w:w="1800"/>
+            <w:tcW w:type="dxa" w:w="1200"/>
             <w:tcBorders>
               <w:top w:val="single" w:color="CCCCCC" w:sz="1"/>
               <w:left w:val="single" w:color="CCCCCC" w:sz="1"/>
@@ -9799,7 +9981,63 @@
         </w:tc>
         <w:tc>
           <w:tcPr>
-            <w:tcW w:type="dxa" w:w="1600"/>
+            <w:tcW w:type="dxa" w:w="1200"/>
+            <w:tcBorders>
+              <w:top w:val="single" w:color="CCCCCC" w:sz="1"/>
+              <w:left w:val="single" w:color="CCCCCC" w:sz="1"/>
+              <w:bottom w:val="single" w:color="CCCCCC" w:sz="1"/>
+              <w:right w:val="single" w:color="CCCCCC" w:sz="1"/>
+            </w:tcBorders>
+            <w:shd w:fill="F8F4F0" w:val="clear"/>
+            <w:tcMar>
+              <w:top w:type="dxa" w:w="80"/>
+              <w:left w:type="dxa" w:w="120"/>
+              <w:bottom w:type="dxa" w:w="80"/>
+              <w:right w:type="dxa" w:w="120"/>
+            </w:tcMar>
+          </w:tcPr>
+          <w:p>
+            <w:r>
+              <w:rPr>
+                <w:rFonts w:ascii="Arial" w:cs="Arial" w:eastAsia="Arial" w:hAnsi="Arial"/>
+                <w:sz w:val="20"/>
+                <w:szCs w:val="20"/>
+              </w:rPr>
+              <w:t xml:space="preserve">$87.5M</w:t>
+            </w:r>
+          </w:p>
+        </w:tc>
+        <w:tc>
+          <w:tcPr>
+            <w:tcW w:type="dxa" w:w="1100"/>
+            <w:tcBorders>
+              <w:top w:val="single" w:color="CCCCCC" w:sz="1"/>
+              <w:left w:val="single" w:color="CCCCCC" w:sz="1"/>
+              <w:bottom w:val="single" w:color="CCCCCC" w:sz="1"/>
+              <w:right w:val="single" w:color="CCCCCC" w:sz="1"/>
+            </w:tcBorders>
+            <w:shd w:fill="F8F4F0" w:val="clear"/>
+            <w:tcMar>
+              <w:top w:type="dxa" w:w="80"/>
+              <w:left w:type="dxa" w:w="120"/>
+              <w:bottom w:type="dxa" w:w="80"/>
+              <w:right w:type="dxa" w:w="120"/>
+            </w:tcMar>
+          </w:tcPr>
+          <w:p>
+            <w:r>
+              <w:rPr>
+                <w:rFonts w:ascii="Arial" w:cs="Arial" w:eastAsia="Arial" w:hAnsi="Arial"/>
+                <w:sz w:val="20"/>
+                <w:szCs w:val="20"/>
+              </w:rPr>
+              <w:t xml:space="preserve">$1,230M</w:t>
+            </w:r>
+          </w:p>
+        </w:tc>
+        <w:tc>
+          <w:tcPr>
+            <w:tcW w:type="dxa" w:w="1100"/>
             <w:tcBorders>
               <w:top w:val="single" w:color="CCCCCC" w:sz="1"/>
               <w:left w:val="single" w:color="CCCCCC" w:sz="1"/>
@@ -9827,7 +10065,7 @@
         </w:tc>
         <w:tc>
           <w:tcPr>
-            <w:tcW w:type="dxa" w:w="2426"/>
+            <w:tcW w:type="dxa" w:w="2126"/>
             <w:tcBorders>
               <w:top w:val="single" w:color="CCCCCC" w:sz="1"/>
               <w:left w:val="single" w:color="CCCCCC" w:sz="1"/>
@@ -9857,7 +10095,7 @@
       <w:tr>
         <w:tc>
           <w:tcPr>
-            <w:tcW w:type="dxa" w:w="1800"/>
+            <w:tcW w:type="dxa" w:w="1400"/>
             <w:tcBorders>
               <w:top w:val="single" w:color="CCCCCC" w:sz="1"/>
               <w:left w:val="single" w:color="CCCCCC" w:sz="1"/>
@@ -9885,7 +10123,7 @@
         </w:tc>
         <w:tc>
           <w:tcPr>
-            <w:tcW w:type="dxa" w:w="1400"/>
+            <w:tcW w:type="dxa" w:w="900"/>
             <w:tcBorders>
               <w:top w:val="single" w:color="CCCCCC" w:sz="1"/>
               <w:left w:val="single" w:color="CCCCCC" w:sz="1"/>
@@ -9913,7 +10151,7 @@
         </w:tc>
         <w:tc>
           <w:tcPr>
-            <w:tcW w:type="dxa" w:w="1800"/>
+            <w:tcW w:type="dxa" w:w="1200"/>
             <w:tcBorders>
               <w:top w:val="single" w:color="CCCCCC" w:sz="1"/>
               <w:left w:val="single" w:color="CCCCCC" w:sz="1"/>
@@ -9941,7 +10179,7 @@
         </w:tc>
         <w:tc>
           <w:tcPr>
-            <w:tcW w:type="dxa" w:w="1600"/>
+            <w:tcW w:type="dxa" w:w="1200"/>
             <w:tcBorders>
               <w:top w:val="single" w:color="CCCCCC" w:sz="1"/>
               <w:left w:val="single" w:color="CCCCCC" w:sz="1"/>
@@ -9963,13 +10201,69 @@
                 <w:sz w:val="20"/>
                 <w:szCs w:val="20"/>
               </w:rPr>
+              <w:t xml:space="preserve">$54,052M</w:t>
+            </w:r>
+          </w:p>
+        </w:tc>
+        <w:tc>
+          <w:tcPr>
+            <w:tcW w:type="dxa" w:w="1100"/>
+            <w:tcBorders>
+              <w:top w:val="single" w:color="CCCCCC" w:sz="1"/>
+              <w:left w:val="single" w:color="CCCCCC" w:sz="1"/>
+              <w:bottom w:val="single" w:color="CCCCCC" w:sz="1"/>
+              <w:right w:val="single" w:color="CCCCCC" w:sz="1"/>
+            </w:tcBorders>
+            <w:shd w:fill="FFFFFF" w:val="clear"/>
+            <w:tcMar>
+              <w:top w:type="dxa" w:w="80"/>
+              <w:left w:type="dxa" w:w="120"/>
+              <w:bottom w:type="dxa" w:w="80"/>
+              <w:right w:type="dxa" w:w="120"/>
+            </w:tcMar>
+          </w:tcPr>
+          <w:p>
+            <w:r>
+              <w:rPr>
+                <w:rFonts w:ascii="Arial" w:cs="Arial" w:eastAsia="Arial" w:hAnsi="Arial"/>
+                <w:sz w:val="20"/>
+                <w:szCs w:val="20"/>
+              </w:rPr>
+              <w:t xml:space="preserve">$1,230M</w:t>
+            </w:r>
+          </w:p>
+        </w:tc>
+        <w:tc>
+          <w:tcPr>
+            <w:tcW w:type="dxa" w:w="1100"/>
+            <w:tcBorders>
+              <w:top w:val="single" w:color="CCCCCC" w:sz="1"/>
+              <w:left w:val="single" w:color="CCCCCC" w:sz="1"/>
+              <w:bottom w:val="single" w:color="CCCCCC" w:sz="1"/>
+              <w:right w:val="single" w:color="CCCCCC" w:sz="1"/>
+            </w:tcBorders>
+            <w:shd w:fill="FFFFFF" w:val="clear"/>
+            <w:tcMar>
+              <w:top w:type="dxa" w:w="80"/>
+              <w:left w:type="dxa" w:w="120"/>
+              <w:bottom w:type="dxa" w:w="80"/>
+              <w:right w:type="dxa" w:w="120"/>
+            </w:tcMar>
+          </w:tcPr>
+          <w:p>
+            <w:r>
+              <w:rPr>
+                <w:rFonts w:ascii="Arial" w:cs="Arial" w:eastAsia="Arial" w:hAnsi="Arial"/>
+                <w:sz w:val="20"/>
+                <w:szCs w:val="20"/>
+              </w:rPr>
               <w:t xml:space="preserve">$55,282M</w:t>
             </w:r>
           </w:p>
         </w:tc>
         <w:tc>
           <w:tcPr>
-            <w:tcW w:type="dxa" w:w="2426"/>
+            <w:tcW w:type="dxa" w:w="2126"/>
             <w:tcBorders>
               <w:top w:val="single" w:color="CCCCCC" w:sz="1"/>
               <w:left w:val="single" w:color="CCCCCC" w:sz="1"/>
@@ -9997,6 +10291,25 @@
         </w:tc>
       </w:tr>
     </w:tbl>
+    <w:p>
+      <w:pPr>
+        <w:spacing w:after="80" w:before="0"/>
+      </w:pPr>
+    </w:p>
+    <w:p>
+      <w:pPr>
+        <w:spacing w:after="120" w:before="60" w:line="360" w:lineRule="auto"/>
+        <w:jc w:val="both"/>
+      </w:pPr>
+      <w:r>
+        <w:rPr>
+          <w:rFonts w:ascii="Arial" w:cs="Arial" w:eastAsia="Arial" w:hAnsi="Arial"/>
+          <w:sz w:val="22"/>
+          <w:szCs w:val="22"/>
+        </w:rPr>
+        <w:t xml:space="preserve">Nota: El cierre de exportaciones ($1,230M = $8.2M/día × 150 días) es un costo fijo inevitable una vez declarado I₀ = 1, independiente del día de detección. La columna "Costo Sacrificio" es el verdadero costo variable que la detección temprana controla: de $0.02M (D3) a $54,052M (sin detección), una diferencia de 2.7 millones de veces.</w:t>
+      </w:r>
+    </w:p>
     <w:p>
       <w:pPr>
         <w:spacing w:after="80" w:before="0"/>

</xml_diff>

<commit_message>
feat(model): phased export closure — 4-stage ramp-up replaces flat rate
- D1-3: $0/day (suspicion, no OMSA notification)
- D4-7: $5.1M/day (US closes = 62% of market)
- D8-14: $7.4M/day (Japan/Korea/EU = 90%)
- D15+: $8.2M/day (full closure = 100%)
- Total 150 days: $1,187M (was $1,230M flat)
- Month 1 export drops from $246M → $203M (visible in table)
- Added export source breakdown in §6.4 (bovine only, not all ag)
- Charts + DOCX regenerated with phased model
</commit_message>
<xml_diff>
--- a/docs/Segundo_avance/Ganado_Saludable_Segundo_Avance.docx
+++ b/docs/Segundo_avance/Ganado_Saludable_Segundo_Avance.docx
@@ -8000,7 +8000,820 @@
           <w:sz w:val="22"/>
           <w:szCs w:val="22"/>
         </w:rPr>
-        <w:t xml:space="preserve">Se proyectó el impacto económico mensual de un escenario donde 1 solo animal infectado con Serotipo O ingresa al hato nacional de 35.1 millones, utilizando el modelo SIR (R₀ = 6.0) y dos componentes de costo: el sacrificio sanitario (valor de mercado de cada animal removido) y el cierre inmediato de exportaciones por la OMSA.</w:t>
+        <w:t xml:space="preserve">Se proyectó el impacto económico mensual de un escenario donde 1 solo animal infectado con Serotipo O ingresa al hato nacional de 35.1 millones, utilizando el modelo SIR (R₀ = 6.0) y dos componentes de costo: el sacrificio sanitario (valor de mercado de cada animal removido) y el cierre de exportaciones bovinas por la OMSA.</w:t>
+      </w:r>
+    </w:p>
+    <w:p>
+      <w:pPr>
+        <w:spacing w:after="40" w:before="0"/>
+      </w:pPr>
+    </w:p>
+    <w:p>
+      <w:pPr>
+        <w:spacing w:after="120" w:before="60" w:line="360" w:lineRule="auto"/>
+        <w:jc w:val="both"/>
+      </w:pPr>
+      <w:r>
+        <w:rPr>
+          <w:rFonts w:ascii="Arial" w:cs="Arial" w:eastAsia="Arial" w:hAnsi="Arial"/>
+          <w:b/>
+          <w:bCs/>
+          <w:sz w:val="22"/>
+          <w:szCs w:val="22"/>
+        </w:rPr>
+        <w:t xml:space="preserve">Modelo de cierre de exportaciones: </w:t>
+      </w:r>
+      <w:r>
+        <w:rPr>
+          <w:rFonts w:ascii="Arial" w:cs="Arial" w:eastAsia="Arial" w:hAnsi="Arial"/>
+          <w:sz w:val="22"/>
+          <w:szCs w:val="22"/>
+        </w:rPr>
+        <w:t xml:space="preserve">El bloqueo comercial no es instantáneo. Se implementó un modelo escalonado basado en los tiempos de reacción documentados de los socios comerciales:</w:t>
+      </w:r>
+    </w:p>
+    <w:p>
+      <w:pPr>
+        <w:spacing w:after="40" w:before="0"/>
+      </w:pPr>
+    </w:p>
+    <w:tbl>
+      <w:tblPr>
+        <w:tblW w:type="dxa" w:w="9026"/>
+        <w:tblBorders>
+          <w:top w:val="single" w:color="auto" w:sz="4"/>
+          <w:left w:val="single" w:color="auto" w:sz="4"/>
+          <w:bottom w:val="single" w:color="auto" w:sz="4"/>
+          <w:right w:val="single" w:color="auto" w:sz="4"/>
+          <w:insideH w:val="single" w:color="auto" w:sz="4"/>
+          <w:insideV w:val="single" w:color="auto" w:sz="4"/>
+        </w:tblBorders>
+      </w:tblPr>
+      <w:tblGrid>
+        <w:gridCol w:w="1800"/>
+        <w:gridCol w:w="800"/>
+        <w:gridCol w:w="1000"/>
+        <w:gridCol w:w="1100"/>
+        <w:gridCol w:w="4326"/>
+      </w:tblGrid>
+      <w:tr>
+        <w:tc>
+          <w:tcPr>
+            <w:tcW w:type="dxa" w:w="1800"/>
+            <w:tcBorders>
+              <w:top w:val="single" w:color="CCCCCC" w:sz="1"/>
+              <w:left w:val="single" w:color="CCCCCC" w:sz="1"/>
+              <w:bottom w:val="single" w:color="CCCCCC" w:sz="1"/>
+              <w:right w:val="single" w:color="CCCCCC" w:sz="1"/>
+            </w:tcBorders>
+            <w:shd w:fill="9C223F" w:val="clear"/>
+            <w:tcMar>
+              <w:top w:type="dxa" w:w="80"/>
+              <w:left w:type="dxa" w:w="120"/>
+              <w:bottom w:type="dxa" w:w="80"/>
+              <w:right w:type="dxa" w:w="120"/>
+            </w:tcMar>
+          </w:tcPr>
+          <w:p>
+            <w:pPr>
+              <w:jc w:val="center"/>
+            </w:pPr>
+            <w:r>
+              <w:rPr>
+                <w:rFonts w:ascii="Arial" w:cs="Arial" w:eastAsia="Arial" w:hAnsi="Arial"/>
+                <w:b/>
+                <w:bCs/>
+                <w:color w:val="FFFFFF"/>
+                <w:sz w:val="20"/>
+                <w:szCs w:val="20"/>
+              </w:rPr>
+              <w:t xml:space="preserve">Fase</w:t>
+            </w:r>
+          </w:p>
+        </w:tc>
+        <w:tc>
+          <w:tcPr>
+            <w:tcW w:type="dxa" w:w="800"/>
+            <w:tcBorders>
+              <w:top w:val="single" w:color="CCCCCC" w:sz="1"/>
+              <w:left w:val="single" w:color="CCCCCC" w:sz="1"/>
+              <w:bottom w:val="single" w:color="CCCCCC" w:sz="1"/>
+              <w:right w:val="single" w:color="CCCCCC" w:sz="1"/>
+            </w:tcBorders>
+            <w:shd w:fill="9C223F" w:val="clear"/>
+            <w:tcMar>
+              <w:top w:type="dxa" w:w="80"/>
+              <w:left w:type="dxa" w:w="120"/>
+              <w:bottom w:type="dxa" w:w="80"/>
+              <w:right w:type="dxa" w:w="120"/>
+            </w:tcMar>
+          </w:tcPr>
+          <w:p>
+            <w:pPr>
+              <w:jc w:val="center"/>
+            </w:pPr>
+            <w:r>
+              <w:rPr>
+                <w:rFonts w:ascii="Arial" w:cs="Arial" w:eastAsia="Arial" w:hAnsi="Arial"/>
+                <w:b/>
+                <w:bCs/>
+                <w:color w:val="FFFFFF"/>
+                <w:sz w:val="20"/>
+                <w:szCs w:val="20"/>
+              </w:rPr>
+              <w:t xml:space="preserve">Días</w:t>
+            </w:r>
+          </w:p>
+        </w:tc>
+        <w:tc>
+          <w:tcPr>
+            <w:tcW w:type="dxa" w:w="1000"/>
+            <w:tcBorders>
+              <w:top w:val="single" w:color="CCCCCC" w:sz="1"/>
+              <w:left w:val="single" w:color="CCCCCC" w:sz="1"/>
+              <w:bottom w:val="single" w:color="CCCCCC" w:sz="1"/>
+              <w:right w:val="single" w:color="CCCCCC" w:sz="1"/>
+            </w:tcBorders>
+            <w:shd w:fill="9C223F" w:val="clear"/>
+            <w:tcMar>
+              <w:top w:type="dxa" w:w="80"/>
+              <w:left w:type="dxa" w:w="120"/>
+              <w:bottom w:type="dxa" w:w="80"/>
+              <w:right w:type="dxa" w:w="120"/>
+            </w:tcMar>
+          </w:tcPr>
+          <w:p>
+            <w:pPr>
+              <w:jc w:val="center"/>
+            </w:pPr>
+            <w:r>
+              <w:rPr>
+                <w:rFonts w:ascii="Arial" w:cs="Arial" w:eastAsia="Arial" w:hAnsi="Arial"/>
+                <w:b/>
+                <w:bCs/>
+                <w:color w:val="FFFFFF"/>
+                <w:sz w:val="20"/>
+                <w:szCs w:val="20"/>
+              </w:rPr>
+              <w:t xml:space="preserve">% Cerrado</w:t>
+            </w:r>
+          </w:p>
+        </w:tc>
+        <w:tc>
+          <w:tcPr>
+            <w:tcW w:type="dxa" w:w="1100"/>
+            <w:tcBorders>
+              <w:top w:val="single" w:color="CCCCCC" w:sz="1"/>
+              <w:left w:val="single" w:color="CCCCCC" w:sz="1"/>
+              <w:bottom w:val="single" w:color="CCCCCC" w:sz="1"/>
+              <w:right w:val="single" w:color="CCCCCC" w:sz="1"/>
+            </w:tcBorders>
+            <w:shd w:fill="9C223F" w:val="clear"/>
+            <w:tcMar>
+              <w:top w:type="dxa" w:w="80"/>
+              <w:left w:type="dxa" w:w="120"/>
+              <w:bottom w:type="dxa" w:w="80"/>
+              <w:right w:type="dxa" w:w="120"/>
+            </w:tcMar>
+          </w:tcPr>
+          <w:p>
+            <w:pPr>
+              <w:jc w:val="center"/>
+            </w:pPr>
+            <w:r>
+              <w:rPr>
+                <w:rFonts w:ascii="Arial" w:cs="Arial" w:eastAsia="Arial" w:hAnsi="Arial"/>
+                <w:b/>
+                <w:bCs/>
+                <w:color w:val="FFFFFF"/>
+                <w:sz w:val="20"/>
+                <w:szCs w:val="20"/>
+              </w:rPr>
+              <w:t xml:space="preserve">Pérdida/día</w:t>
+            </w:r>
+          </w:p>
+        </w:tc>
+        <w:tc>
+          <w:tcPr>
+            <w:tcW w:type="dxa" w:w="4326"/>
+            <w:tcBorders>
+              <w:top w:val="single" w:color="CCCCCC" w:sz="1"/>
+              <w:left w:val="single" w:color="CCCCCC" w:sz="1"/>
+              <w:bottom w:val="single" w:color="CCCCCC" w:sz="1"/>
+              <w:right w:val="single" w:color="CCCCCC" w:sz="1"/>
+            </w:tcBorders>
+            <w:shd w:fill="9C223F" w:val="clear"/>
+            <w:tcMar>
+              <w:top w:type="dxa" w:w="80"/>
+              <w:left w:type="dxa" w:w="120"/>
+              <w:bottom w:type="dxa" w:w="80"/>
+              <w:right w:type="dxa" w:w="120"/>
+            </w:tcMar>
+          </w:tcPr>
+          <w:p>
+            <w:pPr>
+              <w:jc w:val="center"/>
+            </w:pPr>
+            <w:r>
+              <w:rPr>
+                <w:rFonts w:ascii="Arial" w:cs="Arial" w:eastAsia="Arial" w:hAnsi="Arial"/>
+                <w:b/>
+                <w:bCs/>
+                <w:color w:val="FFFFFF"/>
+                <w:sz w:val="20"/>
+                <w:szCs w:val="20"/>
+              </w:rPr>
+              <w:t xml:space="preserve">Descripción</w:t>
+            </w:r>
+          </w:p>
+        </w:tc>
+      </w:tr>
+      <w:tr>
+        <w:tc>
+          <w:tcPr>
+            <w:tcW w:type="dxa" w:w="1800"/>
+            <w:tcBorders>
+              <w:top w:val="single" w:color="CCCCCC" w:sz="1"/>
+              <w:left w:val="single" w:color="CCCCCC" w:sz="1"/>
+              <w:bottom w:val="single" w:color="CCCCCC" w:sz="1"/>
+              <w:right w:val="single" w:color="CCCCCC" w:sz="1"/>
+            </w:tcBorders>
+            <w:shd w:fill="F8F4F0" w:val="clear"/>
+            <w:tcMar>
+              <w:top w:type="dxa" w:w="80"/>
+              <w:left w:type="dxa" w:w="120"/>
+              <w:bottom w:type="dxa" w:w="80"/>
+              <w:right w:type="dxa" w:w="120"/>
+            </w:tcMar>
+          </w:tcPr>
+          <w:p>
+            <w:r>
+              <w:rPr>
+                <w:rFonts w:ascii="Arial" w:cs="Arial" w:eastAsia="Arial" w:hAnsi="Arial"/>
+                <w:sz w:val="20"/>
+                <w:szCs w:val="20"/>
+              </w:rPr>
+              <w:t xml:space="preserve">Sospecha</w:t>
+            </w:r>
+          </w:p>
+        </w:tc>
+        <w:tc>
+          <w:tcPr>
+            <w:tcW w:type="dxa" w:w="800"/>
+            <w:tcBorders>
+              <w:top w:val="single" w:color="CCCCCC" w:sz="1"/>
+              <w:left w:val="single" w:color="CCCCCC" w:sz="1"/>
+              <w:bottom w:val="single" w:color="CCCCCC" w:sz="1"/>
+              <w:right w:val="single" w:color="CCCCCC" w:sz="1"/>
+            </w:tcBorders>
+            <w:shd w:fill="F8F4F0" w:val="clear"/>
+            <w:tcMar>
+              <w:top w:type="dxa" w:w="80"/>
+              <w:left w:type="dxa" w:w="120"/>
+              <w:bottom w:type="dxa" w:w="80"/>
+              <w:right w:type="dxa" w:w="120"/>
+            </w:tcMar>
+          </w:tcPr>
+          <w:p>
+            <w:r>
+              <w:rPr>
+                <w:rFonts w:ascii="Arial" w:cs="Arial" w:eastAsia="Arial" w:hAnsi="Arial"/>
+                <w:sz w:val="20"/>
+                <w:szCs w:val="20"/>
+              </w:rPr>
+              <w:t xml:space="preserve">1-3</w:t>
+            </w:r>
+          </w:p>
+        </w:tc>
+        <w:tc>
+          <w:tcPr>
+            <w:tcW w:type="dxa" w:w="1000"/>
+            <w:tcBorders>
+              <w:top w:val="single" w:color="CCCCCC" w:sz="1"/>
+              <w:left w:val="single" w:color="CCCCCC" w:sz="1"/>
+              <w:bottom w:val="single" w:color="CCCCCC" w:sz="1"/>
+              <w:right w:val="single" w:color="CCCCCC" w:sz="1"/>
+            </w:tcBorders>
+            <w:shd w:fill="F8F4F0" w:val="clear"/>
+            <w:tcMar>
+              <w:top w:type="dxa" w:w="80"/>
+              <w:left w:type="dxa" w:w="120"/>
+              <w:bottom w:type="dxa" w:w="80"/>
+              <w:right w:type="dxa" w:w="120"/>
+            </w:tcMar>
+          </w:tcPr>
+          <w:p>
+            <w:r>
+              <w:rPr>
+                <w:rFonts w:ascii="Arial" w:cs="Arial" w:eastAsia="Arial" w:hAnsi="Arial"/>
+                <w:sz w:val="20"/>
+                <w:szCs w:val="20"/>
+              </w:rPr>
+              <w:t xml:space="preserve">0%</w:t>
+            </w:r>
+          </w:p>
+        </w:tc>
+        <w:tc>
+          <w:tcPr>
+            <w:tcW w:type="dxa" w:w="1100"/>
+            <w:tcBorders>
+              <w:top w:val="single" w:color="CCCCCC" w:sz="1"/>
+              <w:left w:val="single" w:color="CCCCCC" w:sz="1"/>
+              <w:bottom w:val="single" w:color="CCCCCC" w:sz="1"/>
+              <w:right w:val="single" w:color="CCCCCC" w:sz="1"/>
+            </w:tcBorders>
+            <w:shd w:fill="F8F4F0" w:val="clear"/>
+            <w:tcMar>
+              <w:top w:type="dxa" w:w="80"/>
+              <w:left w:type="dxa" w:w="120"/>
+              <w:bottom w:type="dxa" w:w="80"/>
+              <w:right w:type="dxa" w:w="120"/>
+            </w:tcMar>
+          </w:tcPr>
+          <w:p>
+            <w:r>
+              <w:rPr>
+                <w:rFonts w:ascii="Arial" w:cs="Arial" w:eastAsia="Arial" w:hAnsi="Arial"/>
+                <w:sz w:val="20"/>
+                <w:szCs w:val="20"/>
+              </w:rPr>
+              <w:t xml:space="preserve">$0</w:t>
+            </w:r>
+          </w:p>
+        </w:tc>
+        <w:tc>
+          <w:tcPr>
+            <w:tcW w:type="dxa" w:w="4326"/>
+            <w:tcBorders>
+              <w:top w:val="single" w:color="CCCCCC" w:sz="1"/>
+              <w:left w:val="single" w:color="CCCCCC" w:sz="1"/>
+              <w:bottom w:val="single" w:color="CCCCCC" w:sz="1"/>
+              <w:right w:val="single" w:color="CCCCCC" w:sz="1"/>
+            </w:tcBorders>
+            <w:shd w:fill="F8F4F0" w:val="clear"/>
+            <w:tcMar>
+              <w:top w:type="dxa" w:w="80"/>
+              <w:left w:type="dxa" w:w="120"/>
+              <w:bottom w:type="dxa" w:w="80"/>
+              <w:right w:type="dxa" w:w="120"/>
+            </w:tcMar>
+          </w:tcPr>
+          <w:p>
+            <w:r>
+              <w:rPr>
+                <w:rFonts w:ascii="Arial" w:cs="Arial" w:eastAsia="Arial" w:hAnsi="Arial"/>
+                <w:sz w:val="20"/>
+                <w:szCs w:val="20"/>
+              </w:rPr>
+              <w:t xml:space="preserve">Muestras al BSL-3, sin notificación OMSA</w:t>
+            </w:r>
+          </w:p>
+        </w:tc>
+      </w:tr>
+      <w:tr>
+        <w:tc>
+          <w:tcPr>
+            <w:tcW w:type="dxa" w:w="1800"/>
+            <w:tcBorders>
+              <w:top w:val="single" w:color="CCCCCC" w:sz="1"/>
+              <w:left w:val="single" w:color="CCCCCC" w:sz="1"/>
+              <w:bottom w:val="single" w:color="CCCCCC" w:sz="1"/>
+              <w:right w:val="single" w:color="CCCCCC" w:sz="1"/>
+            </w:tcBorders>
+            <w:shd w:fill="FFFFFF" w:val="clear"/>
+            <w:tcMar>
+              <w:top w:type="dxa" w:w="80"/>
+              <w:left w:type="dxa" w:w="120"/>
+              <w:bottom w:type="dxa" w:w="80"/>
+              <w:right w:type="dxa" w:w="120"/>
+            </w:tcMar>
+          </w:tcPr>
+          <w:p>
+            <w:r>
+              <w:rPr>
+                <w:rFonts w:ascii="Arial" w:cs="Arial" w:eastAsia="Arial" w:hAnsi="Arial"/>
+                <w:sz w:val="20"/>
+                <w:szCs w:val="20"/>
+              </w:rPr>
+              <w:t xml:space="preserve">Confirmación + EE.UU.</w:t>
+            </w:r>
+          </w:p>
+        </w:tc>
+        <w:tc>
+          <w:tcPr>
+            <w:tcW w:type="dxa" w:w="800"/>
+            <w:tcBorders>
+              <w:top w:val="single" w:color="CCCCCC" w:sz="1"/>
+              <w:left w:val="single" w:color="CCCCCC" w:sz="1"/>
+              <w:bottom w:val="single" w:color="CCCCCC" w:sz="1"/>
+              <w:right w:val="single" w:color="CCCCCC" w:sz="1"/>
+            </w:tcBorders>
+            <w:shd w:fill="FFFFFF" w:val="clear"/>
+            <w:tcMar>
+              <w:top w:type="dxa" w:w="80"/>
+              <w:left w:type="dxa" w:w="120"/>
+              <w:bottom w:type="dxa" w:w="80"/>
+              <w:right w:type="dxa" w:w="120"/>
+            </w:tcMar>
+          </w:tcPr>
+          <w:p>
+            <w:r>
+              <w:rPr>
+                <w:rFonts w:ascii="Arial" w:cs="Arial" w:eastAsia="Arial" w:hAnsi="Arial"/>
+                <w:sz w:val="20"/>
+                <w:szCs w:val="20"/>
+              </w:rPr>
+              <w:t xml:space="preserve">4-7</w:t>
+            </w:r>
+          </w:p>
+        </w:tc>
+        <w:tc>
+          <w:tcPr>
+            <w:tcW w:type="dxa" w:w="1000"/>
+            <w:tcBorders>
+              <w:top w:val="single" w:color="CCCCCC" w:sz="1"/>
+              <w:left w:val="single" w:color="CCCCCC" w:sz="1"/>
+              <w:bottom w:val="single" w:color="CCCCCC" w:sz="1"/>
+              <w:right w:val="single" w:color="CCCCCC" w:sz="1"/>
+            </w:tcBorders>
+            <w:shd w:fill="FFFFFF" w:val="clear"/>
+            <w:tcMar>
+              <w:top w:type="dxa" w:w="80"/>
+              <w:left w:type="dxa" w:w="120"/>
+              <w:bottom w:type="dxa" w:w="80"/>
+              <w:right w:type="dxa" w:w="120"/>
+            </w:tcMar>
+          </w:tcPr>
+          <w:p>
+            <w:r>
+              <w:rPr>
+                <w:rFonts w:ascii="Arial" w:cs="Arial" w:eastAsia="Arial" w:hAnsi="Arial"/>
+                <w:sz w:val="20"/>
+                <w:szCs w:val="20"/>
+              </w:rPr>
+              <w:t xml:space="preserve">62%</w:t>
+            </w:r>
+          </w:p>
+        </w:tc>
+        <w:tc>
+          <w:tcPr>
+            <w:tcW w:type="dxa" w:w="1100"/>
+            <w:tcBorders>
+              <w:top w:val="single" w:color="CCCCCC" w:sz="1"/>
+              <w:left w:val="single" w:color="CCCCCC" w:sz="1"/>
+              <w:bottom w:val="single" w:color="CCCCCC" w:sz="1"/>
+              <w:right w:val="single" w:color="CCCCCC" w:sz="1"/>
+            </w:tcBorders>
+            <w:shd w:fill="FFFFFF" w:val="clear"/>
+            <w:tcMar>
+              <w:top w:type="dxa" w:w="80"/>
+              <w:left w:type="dxa" w:w="120"/>
+              <w:bottom w:type="dxa" w:w="80"/>
+              <w:right w:type="dxa" w:w="120"/>
+            </w:tcMar>
+          </w:tcPr>
+          <w:p>
+            <w:r>
+              <w:rPr>
+                <w:rFonts w:ascii="Arial" w:cs="Arial" w:eastAsia="Arial" w:hAnsi="Arial"/>
+                <w:sz w:val="20"/>
+                <w:szCs w:val="20"/>
+              </w:rPr>
+              <w:t xml:space="preserve">$5.1M</w:t>
+            </w:r>
+          </w:p>
+        </w:tc>
+        <w:tc>
+          <w:tcPr>
+            <w:tcW w:type="dxa" w:w="4326"/>
+            <w:tcBorders>
+              <w:top w:val="single" w:color="CCCCCC" w:sz="1"/>
+              <w:left w:val="single" w:color="CCCCCC" w:sz="1"/>
+              <w:bottom w:val="single" w:color="CCCCCC" w:sz="1"/>
+              <w:right w:val="single" w:color="CCCCCC" w:sz="1"/>
+            </w:tcBorders>
+            <w:shd w:fill="FFFFFF" w:val="clear"/>
+            <w:tcMar>
+              <w:top w:type="dxa" w:w="80"/>
+              <w:left w:type="dxa" w:w="120"/>
+              <w:bottom w:type="dxa" w:w="80"/>
+              <w:right w:type="dxa" w:w="120"/>
+            </w:tcMar>
+          </w:tcPr>
+          <w:p>
+            <w:r>
+              <w:rPr>
+                <w:rFonts w:ascii="Arial" w:cs="Arial" w:eastAsia="Arial" w:hAnsi="Arial"/>
+                <w:sz w:val="20"/>
+                <w:szCs w:val="20"/>
+              </w:rPr>
+              <w:t xml:space="preserve">RT-PCR → notificación OMSA → EE.UU. cierra ~48h</w:t>
+            </w:r>
+          </w:p>
+        </w:tc>
+      </w:tr>
+      <w:tr>
+        <w:tc>
+          <w:tcPr>
+            <w:tcW w:type="dxa" w:w="1800"/>
+            <w:tcBorders>
+              <w:top w:val="single" w:color="CCCCCC" w:sz="1"/>
+              <w:left w:val="single" w:color="CCCCCC" w:sz="1"/>
+              <w:bottom w:val="single" w:color="CCCCCC" w:sz="1"/>
+              <w:right w:val="single" w:color="CCCCCC" w:sz="1"/>
+            </w:tcBorders>
+            <w:shd w:fill="F8F4F0" w:val="clear"/>
+            <w:tcMar>
+              <w:top w:type="dxa" w:w="80"/>
+              <w:left w:type="dxa" w:w="120"/>
+              <w:bottom w:type="dxa" w:w="80"/>
+              <w:right w:type="dxa" w:w="120"/>
+            </w:tcMar>
+          </w:tcPr>
+          <w:p>
+            <w:r>
+              <w:rPr>
+                <w:rFonts w:ascii="Arial" w:cs="Arial" w:eastAsia="Arial" w:hAnsi="Arial"/>
+                <w:sz w:val="20"/>
+                <w:szCs w:val="20"/>
+              </w:rPr>
+              <w:t xml:space="preserve">Reacción global</w:t>
+            </w:r>
+          </w:p>
+        </w:tc>
+        <w:tc>
+          <w:tcPr>
+            <w:tcW w:type="dxa" w:w="800"/>
+            <w:tcBorders>
+              <w:top w:val="single" w:color="CCCCCC" w:sz="1"/>
+              <w:left w:val="single" w:color="CCCCCC" w:sz="1"/>
+              <w:bottom w:val="single" w:color="CCCCCC" w:sz="1"/>
+              <w:right w:val="single" w:color="CCCCCC" w:sz="1"/>
+            </w:tcBorders>
+            <w:shd w:fill="F8F4F0" w:val="clear"/>
+            <w:tcMar>
+              <w:top w:type="dxa" w:w="80"/>
+              <w:left w:type="dxa" w:w="120"/>
+              <w:bottom w:type="dxa" w:w="80"/>
+              <w:right w:type="dxa" w:w="120"/>
+            </w:tcMar>
+          </w:tcPr>
+          <w:p>
+            <w:r>
+              <w:rPr>
+                <w:rFonts w:ascii="Arial" w:cs="Arial" w:eastAsia="Arial" w:hAnsi="Arial"/>
+                <w:sz w:val="20"/>
+                <w:szCs w:val="20"/>
+              </w:rPr>
+              <w:t xml:space="preserve">8-14</w:t>
+            </w:r>
+          </w:p>
+        </w:tc>
+        <w:tc>
+          <w:tcPr>
+            <w:tcW w:type="dxa" w:w="1000"/>
+            <w:tcBorders>
+              <w:top w:val="single" w:color="CCCCCC" w:sz="1"/>
+              <w:left w:val="single" w:color="CCCCCC" w:sz="1"/>
+              <w:bottom w:val="single" w:color="CCCCCC" w:sz="1"/>
+              <w:right w:val="single" w:color="CCCCCC" w:sz="1"/>
+            </w:tcBorders>
+            <w:shd w:fill="F8F4F0" w:val="clear"/>
+            <w:tcMar>
+              <w:top w:type="dxa" w:w="80"/>
+              <w:left w:type="dxa" w:w="120"/>
+              <w:bottom w:type="dxa" w:w="80"/>
+              <w:right w:type="dxa" w:w="120"/>
+            </w:tcMar>
+          </w:tcPr>
+          <w:p>
+            <w:r>
+              <w:rPr>
+                <w:rFonts w:ascii="Arial" w:cs="Arial" w:eastAsia="Arial" w:hAnsi="Arial"/>
+                <w:sz w:val="20"/>
+                <w:szCs w:val="20"/>
+              </w:rPr>
+              <w:t xml:space="preserve">90%</w:t>
+            </w:r>
+          </w:p>
+        </w:tc>
+        <w:tc>
+          <w:tcPr>
+            <w:tcW w:type="dxa" w:w="1100"/>
+            <w:tcBorders>
+              <w:top w:val="single" w:color="CCCCCC" w:sz="1"/>
+              <w:left w:val="single" w:color="CCCCCC" w:sz="1"/>
+              <w:bottom w:val="single" w:color="CCCCCC" w:sz="1"/>
+              <w:right w:val="single" w:color="CCCCCC" w:sz="1"/>
+            </w:tcBorders>
+            <w:shd w:fill="F8F4F0" w:val="clear"/>
+            <w:tcMar>
+              <w:top w:type="dxa" w:w="80"/>
+              <w:left w:type="dxa" w:w="120"/>
+              <w:bottom w:type="dxa" w:w="80"/>
+              <w:right w:type="dxa" w:w="120"/>
+            </w:tcMar>
+          </w:tcPr>
+          <w:p>
+            <w:r>
+              <w:rPr>
+                <w:rFonts w:ascii="Arial" w:cs="Arial" w:eastAsia="Arial" w:hAnsi="Arial"/>
+                <w:sz w:val="20"/>
+                <w:szCs w:val="20"/>
+              </w:rPr>
+              <w:t xml:space="preserve">$7.4M</w:t>
+            </w:r>
+          </w:p>
+        </w:tc>
+        <w:tc>
+          <w:tcPr>
+            <w:tcW w:type="dxa" w:w="4326"/>
+            <w:tcBorders>
+              <w:top w:val="single" w:color="CCCCCC" w:sz="1"/>
+              <w:left w:val="single" w:color="CCCCCC" w:sz="1"/>
+              <w:bottom w:val="single" w:color="CCCCCC" w:sz="1"/>
+              <w:right w:val="single" w:color="CCCCCC" w:sz="1"/>
+            </w:tcBorders>
+            <w:shd w:fill="F8F4F0" w:val="clear"/>
+            <w:tcMar>
+              <w:top w:type="dxa" w:w="80"/>
+              <w:left w:type="dxa" w:w="120"/>
+              <w:bottom w:type="dxa" w:w="80"/>
+              <w:right w:type="dxa" w:w="120"/>
+            </w:tcMar>
+          </w:tcPr>
+          <w:p>
+            <w:r>
+              <w:rPr>
+                <w:rFonts w:ascii="Arial" w:cs="Arial" w:eastAsia="Arial" w:hAnsi="Arial"/>
+                <w:sz w:val="20"/>
+                <w:szCs w:val="20"/>
+              </w:rPr>
+              <w:t xml:space="preserve">Japón, Corea del Sur, UE cierran</w:t>
+            </w:r>
+          </w:p>
+        </w:tc>
+      </w:tr>
+      <w:tr>
+        <w:tc>
+          <w:tcPr>
+            <w:tcW w:type="dxa" w:w="1800"/>
+            <w:tcBorders>
+              <w:top w:val="single" w:color="CCCCCC" w:sz="1"/>
+              <w:left w:val="single" w:color="CCCCCC" w:sz="1"/>
+              <w:bottom w:val="single" w:color="CCCCCC" w:sz="1"/>
+              <w:right w:val="single" w:color="CCCCCC" w:sz="1"/>
+            </w:tcBorders>
+            <w:shd w:fill="FFFFFF" w:val="clear"/>
+            <w:tcMar>
+              <w:top w:type="dxa" w:w="80"/>
+              <w:left w:type="dxa" w:w="120"/>
+              <w:bottom w:type="dxa" w:w="80"/>
+              <w:right w:type="dxa" w:w="120"/>
+            </w:tcMar>
+          </w:tcPr>
+          <w:p>
+            <w:r>
+              <w:rPr>
+                <w:rFonts w:ascii="Arial" w:cs="Arial" w:eastAsia="Arial" w:hAnsi="Arial"/>
+                <w:sz w:val="20"/>
+                <w:szCs w:val="20"/>
+              </w:rPr>
+              <w:t xml:space="preserve">Cierre total</w:t>
+            </w:r>
+          </w:p>
+        </w:tc>
+        <w:tc>
+          <w:tcPr>
+            <w:tcW w:type="dxa" w:w="800"/>
+            <w:tcBorders>
+              <w:top w:val="single" w:color="CCCCCC" w:sz="1"/>
+              <w:left w:val="single" w:color="CCCCCC" w:sz="1"/>
+              <w:bottom w:val="single" w:color="CCCCCC" w:sz="1"/>
+              <w:right w:val="single" w:color="CCCCCC" w:sz="1"/>
+            </w:tcBorders>
+            <w:shd w:fill="FFFFFF" w:val="clear"/>
+            <w:tcMar>
+              <w:top w:type="dxa" w:w="80"/>
+              <w:left w:type="dxa" w:w="120"/>
+              <w:bottom w:type="dxa" w:w="80"/>
+              <w:right w:type="dxa" w:w="120"/>
+            </w:tcMar>
+          </w:tcPr>
+          <w:p>
+            <w:r>
+              <w:rPr>
+                <w:rFonts w:ascii="Arial" w:cs="Arial" w:eastAsia="Arial" w:hAnsi="Arial"/>
+                <w:sz w:val="20"/>
+                <w:szCs w:val="20"/>
+              </w:rPr>
+              <w:t xml:space="preserve">15+</w:t>
+            </w:r>
+          </w:p>
+        </w:tc>
+        <w:tc>
+          <w:tcPr>
+            <w:tcW w:type="dxa" w:w="1000"/>
+            <w:tcBorders>
+              <w:top w:val="single" w:color="CCCCCC" w:sz="1"/>
+              <w:left w:val="single" w:color="CCCCCC" w:sz="1"/>
+              <w:bottom w:val="single" w:color="CCCCCC" w:sz="1"/>
+              <w:right w:val="single" w:color="CCCCCC" w:sz="1"/>
+            </w:tcBorders>
+            <w:shd w:fill="FFFFFF" w:val="clear"/>
+            <w:tcMar>
+              <w:top w:type="dxa" w:w="80"/>
+              <w:left w:type="dxa" w:w="120"/>
+              <w:bottom w:type="dxa" w:w="80"/>
+              <w:right w:type="dxa" w:w="120"/>
+            </w:tcMar>
+          </w:tcPr>
+          <w:p>
+            <w:r>
+              <w:rPr>
+                <w:rFonts w:ascii="Arial" w:cs="Arial" w:eastAsia="Arial" w:hAnsi="Arial"/>
+                <w:sz w:val="20"/>
+                <w:szCs w:val="20"/>
+              </w:rPr>
+              <w:t xml:space="preserve">100%</w:t>
+            </w:r>
+          </w:p>
+        </w:tc>
+        <w:tc>
+          <w:tcPr>
+            <w:tcW w:type="dxa" w:w="1100"/>
+            <w:tcBorders>
+              <w:top w:val="single" w:color="CCCCCC" w:sz="1"/>
+              <w:left w:val="single" w:color="CCCCCC" w:sz="1"/>
+              <w:bottom w:val="single" w:color="CCCCCC" w:sz="1"/>
+              <w:right w:val="single" w:color="CCCCCC" w:sz="1"/>
+            </w:tcBorders>
+            <w:shd w:fill="FFFFFF" w:val="clear"/>
+            <w:tcMar>
+              <w:top w:type="dxa" w:w="80"/>
+              <w:left w:type="dxa" w:w="120"/>
+              <w:bottom w:type="dxa" w:w="80"/>
+              <w:right w:type="dxa" w:w="120"/>
+            </w:tcMar>
+          </w:tcPr>
+          <w:p>
+            <w:r>
+              <w:rPr>
+                <w:rFonts w:ascii="Arial" w:cs="Arial" w:eastAsia="Arial" w:hAnsi="Arial"/>
+                <w:sz w:val="20"/>
+                <w:szCs w:val="20"/>
+              </w:rPr>
+              <w:t xml:space="preserve">$8.2M</w:t>
+            </w:r>
+          </w:p>
+        </w:tc>
+        <w:tc>
+          <w:tcPr>
+            <w:tcW w:type="dxa" w:w="4326"/>
+            <w:tcBorders>
+              <w:top w:val="single" w:color="CCCCCC" w:sz="1"/>
+              <w:left w:val="single" w:color="CCCCCC" w:sz="1"/>
+              <w:bottom w:val="single" w:color="CCCCCC" w:sz="1"/>
+              <w:right w:val="single" w:color="CCCCCC" w:sz="1"/>
+            </w:tcBorders>
+            <w:shd w:fill="FFFFFF" w:val="clear"/>
+            <w:tcMar>
+              <w:top w:type="dxa" w:w="80"/>
+              <w:left w:type="dxa" w:w="120"/>
+              <w:bottom w:type="dxa" w:w="80"/>
+              <w:right w:type="dxa" w:w="120"/>
+            </w:tcMar>
+          </w:tcPr>
+          <w:p>
+            <w:r>
+              <w:rPr>
+                <w:rFonts w:ascii="Arial" w:cs="Arial" w:eastAsia="Arial" w:hAnsi="Arial"/>
+                <w:sz w:val="20"/>
+                <w:szCs w:val="20"/>
+              </w:rPr>
+              <w:t xml:space="preserve">Bloqueo completo de exportaciones bovinas</w:t>
+            </w:r>
+          </w:p>
+        </w:tc>
+      </w:tr>
+    </w:tbl>
+    <w:p>
+      <w:pPr>
+        <w:spacing w:after="40" w:before="0"/>
+      </w:pPr>
+    </w:p>
+    <w:p>
+      <w:pPr>
+        <w:spacing w:after="120" w:before="60" w:line="360" w:lineRule="auto"/>
+        <w:jc w:val="both"/>
+      </w:pPr>
+      <w:r>
+        <w:rPr>
+          <w:rFonts w:ascii="Arial" w:cs="Arial" w:eastAsia="Arial" w:hAnsi="Arial"/>
+          <w:sz w:val="22"/>
+          <w:szCs w:val="22"/>
+        </w:rPr>
+        <w:t xml:space="preserve">Fuente del mercado: Exportaciones bovinas de México: $1,015M (ganado vivo) + $1,700M (carne de res) + ~$285M (subproductos) = ~$3,000M USD/año (USDA ERS 2024 / GCMA). Se refiere exclusivamente al sector bovino, no a toda la agricultura.</w:t>
       </w:r>
     </w:p>
     <w:p>
@@ -8371,7 +9184,7 @@
                 <w:sz w:val="20"/>
                 <w:szCs w:val="20"/>
               </w:rPr>
-              <w:t xml:space="preserve">$246,000,000</w:t>
+              <w:t xml:space="preserve">$203,196,000</w:t>
             </w:r>
           </w:p>
         </w:tc>
@@ -8399,7 +9212,7 @@
                 <w:sz w:val="20"/>
                 <w:szCs w:val="20"/>
               </w:rPr>
-              <w:t xml:space="preserve">$248,956,436</w:t>
+              <w:t xml:space="preserve">$206,152,436</w:t>
             </w:r>
           </w:p>
         </w:tc>
@@ -8569,7 +9382,7 @@
                 <w:sz w:val="20"/>
                 <w:szCs w:val="20"/>
               </w:rPr>
-              <w:t xml:space="preserve">$13,993,371,594</w:t>
+              <w:t xml:space="preserve">$13,950,567,594</w:t>
             </w:r>
           </w:p>
         </w:tc>
@@ -8739,7 +9552,7 @@
                 <w:sz w:val="20"/>
                 <w:szCs w:val="20"/>
               </w:rPr>
-              <w:t xml:space="preserve">$47,788,256,623</w:t>
+              <w:t xml:space="preserve">$47,745,452,623</w:t>
             </w:r>
           </w:p>
         </w:tc>
@@ -8909,7 +9722,7 @@
                 <w:sz w:val="20"/>
                 <w:szCs w:val="20"/>
               </w:rPr>
-              <w:t xml:space="preserve">$52,122,632,249</w:t>
+              <w:t xml:space="preserve">$52,079,828,249</w:t>
             </w:r>
           </w:p>
         </w:tc>
@@ -9079,7 +9892,7 @@
                 <w:sz w:val="20"/>
                 <w:szCs w:val="20"/>
               </w:rPr>
-              <w:t xml:space="preserve">$52,821,845,106</w:t>
+              <w:t xml:space="preserve">$52,779,041,106</w:t>
             </w:r>
           </w:p>
         </w:tc>
@@ -9111,7 +9924,7 @@
           <w:sz w:val="22"/>
           <w:szCs w:val="22"/>
         </w:rPr>
-        <w:t xml:space="preserve">Con R₀ = 6.0, la FMD no es lineal — es una detonación nuclear biológica. En el Mes 1 parece controlable (1,904 sacrificados), pero en el Mes 2 ya son 8.7 millones y en el Mes 3, 21.7 millones. El costo del sacrificio sanitario domina completamente al cierre de exportaciones ($33.5B vs $246M en el mes pico). A 5 meses, la pérdida acumulada alcanza $52.8 Billion USD — equivalente al 4% del PIB de México.</w:t>
+        <w:t xml:space="preserve">Con R₀ = 6.0, la FMD no es lineal — es una detonación nuclear biológica. En el Mes 1 parece controlable (1,904 sacrificados), pero en el Mes 2 ya son 8.7 millones y en el Mes 3, 21.7 millones. El Mes 1 muestra un cierre de exportaciones menor ($203M vs $246M) debido al modelo escalonado: los primeros 3 días son de sospecha sin notificación oficial. A 5 meses, la pérdida acumulada alcanza $52.8 Billion USD — equivalente al 4% del PIB de México.</w:t>
       </w:r>
     </w:p>
     <w:p>
@@ -9198,7 +10011,7 @@
           <w:sz w:val="18"/>
           <w:szCs w:val="18"/>
         </w:rPr>
-        <w:t xml:space="preserve">Figura 12. Flujo de caja mensual FMD — Costo del sacrificio sanitario derivado del modelo SIR (R₀ = 6.0).</w:t>
+        <w:t xml:space="preserve">Figura 12. Flujo de caja mensual FMD — Costo del sacrificio sanitario derivado del modelo SIR (R₀ = 6.0). Cierre de exportaciones con modelo escalonado de 4 fases.</w:t>
       </w:r>
     </w:p>
     <w:p>
@@ -9607,7 +10420,7 @@
                 <w:sz w:val="20"/>
                 <w:szCs w:val="20"/>
               </w:rPr>
-              <w:t xml:space="preserve">$0.02M</w:t>
+              <w:t xml:space="preserve">$0.03M</w:t>
             </w:r>
           </w:p>
         </w:tc>
@@ -9635,7 +10448,7 @@
                 <w:sz w:val="20"/>
                 <w:szCs w:val="20"/>
               </w:rPr>
-              <w:t xml:space="preserve">$1,230M</w:t>
+              <w:t xml:space="preserve">$1,187M</w:t>
             </w:r>
           </w:p>
         </w:tc>
@@ -9663,7 +10476,7 @@
                 <w:sz w:val="20"/>
                 <w:szCs w:val="20"/>
               </w:rPr>
-              <w:t xml:space="preserve">$1,230M</w:t>
+              <w:t xml:space="preserve">$1,187M</w:t>
             </w:r>
           </w:p>
         </w:tc>
@@ -9691,7 +10504,7 @@
                 <w:sz w:val="20"/>
                 <w:szCs w:val="20"/>
               </w:rPr>
-              <w:t xml:space="preserve">$54.05B (97.77%)</w:t>
+              <w:t xml:space="preserve">$54.05B (97.9%)</w:t>
             </w:r>
           </w:p>
         </w:tc>
@@ -9833,7 +10646,7 @@
                 <w:sz w:val="20"/>
                 <w:szCs w:val="20"/>
               </w:rPr>
-              <w:t xml:space="preserve">$1,230M</w:t>
+              <w:t xml:space="preserve">$1,187M</w:t>
             </w:r>
           </w:p>
         </w:tc>
@@ -9861,7 +10674,7 @@
                 <w:sz w:val="20"/>
                 <w:szCs w:val="20"/>
               </w:rPr>
-              <w:t xml:space="preserve">$1,231M</w:t>
+              <w:t xml:space="preserve">$1,188M</w:t>
             </w:r>
           </w:p>
         </w:tc>
@@ -9889,7 +10702,7 @@
                 <w:sz w:val="20"/>
                 <w:szCs w:val="20"/>
               </w:rPr>
-              <w:t xml:space="preserve">$54.05B (97.77%)</w:t>
+              <w:t xml:space="preserve">$54.05B (97.8%)</w:t>
             </w:r>
           </w:p>
         </w:tc>
@@ -10031,7 +10844,7 @@
                 <w:sz w:val="20"/>
                 <w:szCs w:val="20"/>
               </w:rPr>
-              <w:t xml:space="preserve">$1,230M</w:t>
+              <w:t xml:space="preserve">$1,187M</w:t>
             </w:r>
           </w:p>
         </w:tc>
@@ -10059,7 +10872,7 @@
                 <w:sz w:val="20"/>
                 <w:szCs w:val="20"/>
               </w:rPr>
-              <w:t xml:space="preserve">$1,318M</w:t>
+              <w:t xml:space="preserve">$1,275M</w:t>
             </w:r>
           </w:p>
         </w:tc>
@@ -10087,7 +10900,7 @@
                 <w:sz w:val="20"/>
                 <w:szCs w:val="20"/>
               </w:rPr>
-              <w:t xml:space="preserve">$53.96B (97.62%)</w:t>
+              <w:t xml:space="preserve">$53.96B (97.7%)</w:t>
             </w:r>
           </w:p>
         </w:tc>
@@ -10229,7 +11042,7 @@
                 <w:sz w:val="20"/>
                 <w:szCs w:val="20"/>
               </w:rPr>
-              <w:t xml:space="preserve">$1,230M</w:t>
+              <w:t xml:space="preserve">$1,187M</w:t>
             </w:r>
           </w:p>
         </w:tc>
@@ -10257,7 +11070,7 @@
                 <w:sz w:val="20"/>
                 <w:szCs w:val="20"/>
               </w:rPr>
-              <w:t xml:space="preserve">$55,282M</w:t>
+              <w:t xml:space="preserve">$55,239M</w:t>
             </w:r>
           </w:p>
         </w:tc>
@@ -10307,7 +11120,7 @@
           <w:sz w:val="22"/>
           <w:szCs w:val="22"/>
         </w:rPr>
-        <w:t xml:space="preserve">Nota: El cierre de exportaciones ($1,230M = $8.2M/día × 150 días) es un costo fijo inevitable una vez declarado I₀ = 1, independiente del día de detección. La columna "Costo Sacrificio" es el verdadero costo variable que la detección temprana controla: de $0.02M (D3) a $54,052M (sin detección), una diferencia de 2.7 millones de veces.</w:t>
+        <w:t xml:space="preserve">Nota metodológica: El cierre de exportaciones ($1,187M) se modela con un ramp-up escalonado de 4 fases, no como pérdida instantánea. Es un costo constante entre escenarios porque se activa con I₀ = 1 independientemente del día de detección. La columna "Costo Sacrificio" es el verdadero costo variable que la detección temprana controla. Adicionalmente, el horizonte de 150 días subestima el impacto real, ya que la recuperación del estatus sanitario ante la OMSA requiere entre 6 y 24 meses adicionales post-erradicación (Anderson, 2002).</w:t>
       </w:r>
     </w:p>
     <w:p>
@@ -10390,7 +11203,7 @@
           <w:sz w:val="22"/>
           <w:szCs w:val="22"/>
         </w:rPr>
-        <w:t xml:space="preserve">El cierre de exportaciones domina el costo: Incluso con detección en Día 3 (solo 16 animales), el cierre OMSA de exportaciones genera $1.23B en pérdidas. Este costo es inevitable una vez declarado I₀ = 1, lo que refuerza que la única defensa real es la prevención absoluta.</w:t>
+        <w:t xml:space="preserve">El cierre de exportaciones domina el costo en escenarios controlados: Incluso con detección en Día 3 (solo 16 animales), el cierre de exportaciones bovinas genera $1.19B en pérdidas. Este costo es inevitable una vez declarado I₀ = 1, lo que refuerza que la única defensa real es la prevención absoluta.</w:t>
       </w:r>
     </w:p>
     <w:p>
@@ -10419,7 +11232,7 @@
           <w:sz w:val="22"/>
           <w:szCs w:val="22"/>
         </w:rPr>
-        <w:t xml:space="preserve">A modo de referencia, la TB Bovina (endémica, R₀ = 1.8) genera pérdidas de ~$7.8M USD en 12 meses sin detección. La FMD genera $55.3B USD en 5 meses — una diferencia de 7,000x. Esto valida la decisión estratégica de usar TB como proxy de calibración: si el modelo funciona para el "sangrado silencioso" de TB, está preparado para el "colapso nuclear" de FMD.</w:t>
+        <w:t xml:space="preserve">A modo de referencia, la TB Bovina (endémica, R₀ = 1.8) genera pérdidas de ~$7.8M USD en 12 meses sin detección. La FMD genera $55.2B USD en 5 meses — una diferencia de 7,000x. Esto valida la decisión estratégica de usar TB como proxy de calibración: si el modelo funciona para el "sangrado silencioso" de TB, está preparado para el "colapso nuclear" de FMD.</w:t>
       </w:r>
     </w:p>
     <w:p>

</xml_diff>

<commit_message>
fix(sources): verified market shares + per-phase citations
CORRECTED: US = ~90% of combined bovine market (was 62%)
  - Live cattle: ~100% to US (USDA FAS GATS 2024)
  - Beef: ~86% to US (AHDB 2024)
  - Combined: ~90% (not 62% as prev. estimated)

Phase citations added per row in MD/DOCX tables:
  - D1-3: Protocolo DINESA (SENASICA); OIE Manual 3.1.8
  - D4-7: WOAH TAHC Art. 1.1.3; UK 2001 precedent (Anderson 2002)
  - D8-14: MAFF Japan contingency; CFIA Canada
  - D15+: WOAH TAHC Ch. 8.8

Financial impact: Export closure = $1,201M (was $1,187M)
Month 1 export = $217M (was $203M)
</commit_message>
<xml_diff>
--- a/docs/Segundo_avance/Ganado_Saludable_Segundo_Avance.docx
+++ b/docs/Segundo_avance/Ganado_Saludable_Segundo_Avance.docx
@@ -8223,7 +8223,7 @@
                 <w:sz w:val="20"/>
                 <w:szCs w:val="20"/>
               </w:rPr>
-              <w:t xml:space="preserve">Descripción</w:t>
+              <w:t xml:space="preserve">Fuente</w:t>
             </w:r>
           </w:p>
         </w:tc>
@@ -8365,7 +8365,7 @@
                 <w:sz w:val="20"/>
                 <w:szCs w:val="20"/>
               </w:rPr>
-              <w:t xml:space="preserve">Muestras al BSL-3, sin notificación OMSA</w:t>
+              <w:t xml:space="preserve">Protocolo DINESA (SENASICA); OIE Manual 3.1.8</w:t>
             </w:r>
           </w:p>
         </w:tc>
@@ -8451,7 +8451,7 @@
                 <w:sz w:val="20"/>
                 <w:szCs w:val="20"/>
               </w:rPr>
-              <w:t xml:space="preserve">62%</w:t>
+              <w:t xml:space="preserve">90%</w:t>
             </w:r>
           </w:p>
         </w:tc>
@@ -8479,7 +8479,7 @@
                 <w:sz w:val="20"/>
                 <w:szCs w:val="20"/>
               </w:rPr>
-              <w:t xml:space="preserve">$5.1M</w:t>
+              <w:t xml:space="preserve">$7.4M</w:t>
             </w:r>
           </w:p>
         </w:tc>
@@ -8507,7 +8507,7 @@
                 <w:sz w:val="20"/>
                 <w:szCs w:val="20"/>
               </w:rPr>
-              <w:t xml:space="preserve">RT-PCR → notificación OMSA → EE.UU. cierra ~48h</w:t>
+              <w:t xml:space="preserve">WOAH TAHC Art. 1.1.3; UK 2001 (Anderson Report)</w:t>
             </w:r>
           </w:p>
         </w:tc>
@@ -8593,7 +8593,7 @@
                 <w:sz w:val="20"/>
                 <w:szCs w:val="20"/>
               </w:rPr>
-              <w:t xml:space="preserve">90%</w:t>
+              <w:t xml:space="preserve">98%</w:t>
             </w:r>
           </w:p>
         </w:tc>
@@ -8621,7 +8621,7 @@
                 <w:sz w:val="20"/>
                 <w:szCs w:val="20"/>
               </w:rPr>
-              <w:t xml:space="preserve">$7.4M</w:t>
+              <w:t xml:space="preserve">$8.0M</w:t>
             </w:r>
           </w:p>
         </w:tc>
@@ -8649,7 +8649,7 @@
                 <w:sz w:val="20"/>
                 <w:szCs w:val="20"/>
               </w:rPr>
-              <w:t xml:space="preserve">Japón, Corea del Sur, UE cierran</w:t>
+              <w:t xml:space="preserve">MAFF Japan FMD contingency; CFIA Canada</w:t>
             </w:r>
           </w:p>
         </w:tc>
@@ -8791,7 +8791,7 @@
                 <w:sz w:val="20"/>
                 <w:szCs w:val="20"/>
               </w:rPr>
-              <w:t xml:space="preserve">Bloqueo completo de exportaciones bovinas</w:t>
+              <w:t xml:space="preserve">WOAH TAHC Ch. 8.8</w:t>
             </w:r>
           </w:p>
         </w:tc>
@@ -8813,7 +8813,7 @@
           <w:sz w:val="22"/>
           <w:szCs w:val="22"/>
         </w:rPr>
-        <w:t xml:space="preserve">Fuente del mercado: Exportaciones bovinas de México: $1,015M (ganado vivo) + $1,700M (carne de res) + ~$285M (subproductos) = ~$3,000M USD/año (USDA ERS 2024 / GCMA). Se refiere exclusivamente al sector bovino, no a toda la agricultura.</w:t>
+        <w:t xml:space="preserve">Fuente del mercado: Exportaciones bovinas de México: $1,015M (ganado vivo, ~100% a EE.UU.) + $1,700M (carne de res, ~86% a EE.UU.) + ~$285M (subproductos) = ~$3,000M USD/año (USDA FAS GATS 2024; AHDB 2024). EE.UU. = ~90% del mercado combinado bovino.</w:t>
       </w:r>
     </w:p>
     <w:p>
@@ -9184,7 +9184,7 @@
                 <w:sz w:val="20"/>
                 <w:szCs w:val="20"/>
               </w:rPr>
-              <w:t xml:space="preserve">$203,196,000</w:t>
+              <w:t xml:space="preserve">$216,972,000</w:t>
             </w:r>
           </w:p>
         </w:tc>
@@ -9212,7 +9212,7 @@
                 <w:sz w:val="20"/>
                 <w:szCs w:val="20"/>
               </w:rPr>
-              <w:t xml:space="preserve">$206,152,436</w:t>
+              <w:t xml:space="preserve">$219,928,436</w:t>
             </w:r>
           </w:p>
         </w:tc>
@@ -9382,7 +9382,7 @@
                 <w:sz w:val="20"/>
                 <w:szCs w:val="20"/>
               </w:rPr>
-              <w:t xml:space="preserve">$13,950,567,594</w:t>
+              <w:t xml:space="preserve">$13,964,343,594</w:t>
             </w:r>
           </w:p>
         </w:tc>
@@ -9552,7 +9552,7 @@
                 <w:sz w:val="20"/>
                 <w:szCs w:val="20"/>
               </w:rPr>
-              <w:t xml:space="preserve">$47,745,452,623</w:t>
+              <w:t xml:space="preserve">$47,759,228,623</w:t>
             </w:r>
           </w:p>
         </w:tc>
@@ -9722,7 +9722,7 @@
                 <w:sz w:val="20"/>
                 <w:szCs w:val="20"/>
               </w:rPr>
-              <w:t xml:space="preserve">$52,079,828,249</w:t>
+              <w:t xml:space="preserve">$52,093,604,249</w:t>
             </w:r>
           </w:p>
         </w:tc>
@@ -9892,7 +9892,7 @@
                 <w:sz w:val="20"/>
                 <w:szCs w:val="20"/>
               </w:rPr>
-              <w:t xml:space="preserve">$52,779,041,106</w:t>
+              <w:t xml:space="preserve">$52,792,817,106</w:t>
             </w:r>
           </w:p>
         </w:tc>
@@ -9924,7 +9924,7 @@
           <w:sz w:val="22"/>
           <w:szCs w:val="22"/>
         </w:rPr>
-        <w:t xml:space="preserve">Con R₀ = 6.0, la FMD no es lineal — es una detonación nuclear biológica. En el Mes 1 parece controlable (1,904 sacrificados), pero en el Mes 2 ya son 8.7 millones y en el Mes 3, 21.7 millones. El Mes 1 muestra un cierre de exportaciones menor ($203M vs $246M) debido al modelo escalonado: los primeros 3 días son de sospecha sin notificación oficial. A 5 meses, la pérdida acumulada alcanza $52.8 Billion USD — equivalente al 4% del PIB de México.</w:t>
+        <w:t xml:space="preserve">Con R₀ = 6.0, la FMD no es lineal — es una detonación nuclear biológica. En el Mes 1 parece controlable (1,904 sacrificados), pero en el Mes 2 ya son 8.7 millones y en el Mes 3, 21.7 millones. El Mes 1 muestra un cierre de exportaciones menor ($217M vs $246M) debido al modelo escalonado. A 5 meses, la pérdida acumulada alcanza $52.8 Billion USD — equivalente al 4% del PIB de México.</w:t>
       </w:r>
     </w:p>
     <w:p>
@@ -10448,7 +10448,7 @@
                 <w:sz w:val="20"/>
                 <w:szCs w:val="20"/>
               </w:rPr>
-              <w:t xml:space="preserve">$1,187M</w:t>
+              <w:t xml:space="preserve">$1,201M</w:t>
             </w:r>
           </w:p>
         </w:tc>
@@ -10476,7 +10476,7 @@
                 <w:sz w:val="20"/>
                 <w:szCs w:val="20"/>
               </w:rPr>
-              <w:t xml:space="preserve">$1,187M</w:t>
+              <w:t xml:space="preserve">$1,201M</w:t>
             </w:r>
           </w:p>
         </w:tc>
@@ -10504,7 +10504,7 @@
                 <w:sz w:val="20"/>
                 <w:szCs w:val="20"/>
               </w:rPr>
-              <w:t xml:space="preserve">$54.05B (97.9%)</w:t>
+              <w:t xml:space="preserve">$54.05B (97.8%)</w:t>
             </w:r>
           </w:p>
         </w:tc>
@@ -10646,7 +10646,7 @@
                 <w:sz w:val="20"/>
                 <w:szCs w:val="20"/>
               </w:rPr>
-              <w:t xml:space="preserve">$1,187M</w:t>
+              <w:t xml:space="preserve">$1,201M</w:t>
             </w:r>
           </w:p>
         </w:tc>
@@ -10674,7 +10674,7 @@
                 <w:sz w:val="20"/>
                 <w:szCs w:val="20"/>
               </w:rPr>
-              <w:t xml:space="preserve">$1,188M</w:t>
+              <w:t xml:space="preserve">$1,202M</w:t>
             </w:r>
           </w:p>
         </w:tc>
@@ -10844,7 +10844,7 @@
                 <w:sz w:val="20"/>
                 <w:szCs w:val="20"/>
               </w:rPr>
-              <w:t xml:space="preserve">$1,187M</w:t>
+              <w:t xml:space="preserve">$1,201M</w:t>
             </w:r>
           </w:p>
         </w:tc>
@@ -10872,7 +10872,7 @@
                 <w:sz w:val="20"/>
                 <w:szCs w:val="20"/>
               </w:rPr>
-              <w:t xml:space="preserve">$1,275M</w:t>
+              <w:t xml:space="preserve">$1,288M</w:t>
             </w:r>
           </w:p>
         </w:tc>
@@ -11042,7 +11042,7 @@
                 <w:sz w:val="20"/>
                 <w:szCs w:val="20"/>
               </w:rPr>
-              <w:t xml:space="preserve">$1,187M</w:t>
+              <w:t xml:space="preserve">$1,201M</w:t>
             </w:r>
           </w:p>
         </w:tc>
@@ -11070,7 +11070,7 @@
                 <w:sz w:val="20"/>
                 <w:szCs w:val="20"/>
               </w:rPr>
-              <w:t xml:space="preserve">$55,239M</w:t>
+              <w:t xml:space="preserve">$55,253M</w:t>
             </w:r>
           </w:p>
         </w:tc>
@@ -11120,7 +11120,7 @@
           <w:sz w:val="22"/>
           <w:szCs w:val="22"/>
         </w:rPr>
-        <w:t xml:space="preserve">Nota metodológica: El cierre de exportaciones ($1,187M) se modela con un ramp-up escalonado de 4 fases, no como pérdida instantánea. Es un costo constante entre escenarios porque se activa con I₀ = 1 independientemente del día de detección. La columna "Costo Sacrificio" es el verdadero costo variable que la detección temprana controla. Adicionalmente, el horizonte de 150 días subestima el impacto real, ya que la recuperación del estatus sanitario ante la OMSA requiere entre 6 y 24 meses adicionales post-erradicación (Anderson, 2002).</w:t>
+        <w:t xml:space="preserve">Nota metodológica: El cierre de exportaciones ($1,201M) se modela con un ramp-up escalonado de 4 fases basado en market shares verificados (USDA FAS GATS 2024: EE.UU. = ~90% del mercado bovino). Es un costo constante entre escenarios porque se activa con I₀ = 1. La columna 'Costo Sacrificio' es el verdadero costo variable. El horizonte de 150 días subestima el impacto real: la OMSA requiere 6-24 meses post-erradicación para recuperar estatus libre (Anderson, 2002).</w:t>
       </w:r>
     </w:p>
     <w:p>
@@ -11203,7 +11203,7 @@
           <w:sz w:val="22"/>
           <w:szCs w:val="22"/>
         </w:rPr>
-        <w:t xml:space="preserve">El cierre de exportaciones domina el costo en escenarios controlados: Incluso con detección en Día 3 (solo 16 animales), el cierre de exportaciones bovinas genera $1.19B en pérdidas. Este costo es inevitable una vez declarado I₀ = 1, lo que refuerza que la única defensa real es la prevención absoluta.</w:t>
+        <w:t xml:space="preserve">El cierre de exportaciones domina el costo en escenarios controlados: Incluso con detección en Día 3 (solo 16 animales), el cierre de exportaciones bovinas genera $1.20B en pérdidas. Este costo es inevitable una vez declarado I₀ = 1.</w:t>
       </w:r>
     </w:p>
     <w:p>
@@ -11232,7 +11232,7 @@
           <w:sz w:val="22"/>
           <w:szCs w:val="22"/>
         </w:rPr>
-        <w:t xml:space="preserve">A modo de referencia, la TB Bovina (endémica, R₀ = 1.8) genera pérdidas de ~$7.8M USD en 12 meses sin detección. La FMD genera $55.2B USD en 5 meses — una diferencia de 7,000x. Esto valida la decisión estratégica de usar TB como proxy de calibración: si el modelo funciona para el "sangrado silencioso" de TB, está preparado para el "colapso nuclear" de FMD.</w:t>
+        <w:t xml:space="preserve">A modo de referencia, la TB Bovina (endémica, R₀ = 1.8) genera pérdidas de ~$7.8M USD en 12 meses sin detección. La FMD genera $55.3B USD en 5 meses — una diferencia de 7,000x.</w:t>
       </w:r>
     </w:p>
     <w:p>

</xml_diff>

<commit_message>
docs: include explicit export loss methodology and formula
</commit_message>
<xml_diff>
--- a/docs/Segundo_avance/Ganado_Saludable_Segundo_Avance.docx
+++ b/docs/Segundo_avance/Ganado_Saludable_Segundo_Avance.docx
@@ -8814,6 +8814,35 @@
           <w:szCs w:val="22"/>
         </w:rPr>
         <w:t xml:space="preserve">Fuente del mercado: Exportaciones bovinas de México: $1,015M (ganado vivo, ~100% a EE.UU.) + $1,700M (carne de res, ~86% a EE.UU.) + ~$285M (subproductos) = ~$3,000M USD/año (USDA FAS GATS 2024; AHDB 2024). EE.UU. = ~90% del mercado combinado bovino.</w:t>
+      </w:r>
+    </w:p>
+    <w:p>
+      <w:pPr>
+        <w:spacing w:after="40" w:before="0"/>
+      </w:pPr>
+    </w:p>
+    <w:p>
+      <w:pPr>
+        <w:spacing w:after="120" w:before="60" w:line="360" w:lineRule="auto"/>
+        <w:jc w:val="both"/>
+      </w:pPr>
+      <w:r>
+        <w:rPr>
+          <w:rFonts w:ascii="Arial" w:cs="Arial" w:eastAsia="Arial" w:hAnsi="Arial"/>
+          <w:b/>
+          <w:bCs/>
+          <w:sz w:val="22"/>
+          <w:szCs w:val="22"/>
+        </w:rPr>
+        <w:t xml:space="preserve">Metodología de Cálculo: </w:t>
+      </w:r>
+      <w:r>
+        <w:rPr>
+          <w:rFonts w:ascii="Arial" w:cs="Arial" w:eastAsia="Arial" w:hAnsi="Arial"/>
+          <w:sz w:val="22"/>
+          <w:szCs w:val="22"/>
+        </w:rPr>
+        <w:t xml:space="preserve">La pérdida se estima como L = (V_anual / 365) * %_Fase. Con un V_anual de $3,000M USD, la pérdida máxima es de $8.22M USD/día. El costo de $1,201M USD en los escenarios es la sumatoria de estas pérdidas diarias a 150 días, integrando el ramp-up de los primeros 14 días.</w:t>
       </w:r>
     </w:p>
     <w:p>

</xml_diff>

<commit_message>
docs: expand key findings with mathematical justification and proxy comparisons
</commit_message>
<xml_diff>
--- a/docs/Segundo_avance/Ganado_Saludable_Segundo_Avance.docx
+++ b/docs/Segundo_avance/Ganado_Saludable_Segundo_Avance.docx
@@ -11170,7 +11170,7 @@
           <w:sz w:val="22"/>
           <w:szCs w:val="22"/>
         </w:rPr>
-        <w:t xml:space="preserve">Hallazgos clave:</w:t>
+        <w:t xml:space="preserve">Hallazgos clave y Justificación Matemática:</w:t>
       </w:r>
     </w:p>
     <w:p>
@@ -11194,7 +11194,7 @@
           <w:sz w:val="22"/>
           <w:szCs w:val="22"/>
         </w:rPr>
-        <w:t xml:space="preserve">Cada día cuenta exponencialmente: La diferencia entre detectar en el Día 3 (16 animales sacrificados) vs. el Día 30 (56,674) es de 3,542x — pero ambos siguen siendo manejables comparados con la catástrofe de no detectar (35 millones).</w:t>
+        <w:t xml:space="preserve">Cada día cuenta exponencialmente (Crecimiento Viral): La diferencia entre detectar en el Día 3 (16 animales sacrificados) vs. el Día 30 (56,674) es de una magnitud de 3,542x. Esto ocurre porque la curva de contagio inicial sigue la ecuación I(t) = I_0 * e^((R_0 - 1)*gamma*t). Con un R_0 = 6.0, el crecimiento no es lineal, es una explosión demográfica exponencial. A pesar de esto, 56 mil animales sigue siendo manejable comparado con la catástrofe de no detectar (35 millones).</w:t>
       </w:r>
     </w:p>
     <w:p>
@@ -11213,7 +11213,7 @@
           <w:sz w:val="22"/>
           <w:szCs w:val="22"/>
         </w:rPr>
-        <w:t xml:space="preserve">El ROI de la vigilancia es astronómico: El costo anual del sistema de vigilancia epidemiológica de la CPA (~$20M USD estimados) evita pérdidas de $54 Billion USD. Eso es un ROI de 2,700:1.</w:t>
+        <w:t xml:space="preserve">El ROI de la vigilancia es astronómico (2,700:1): Calculamos el Retorno de Inversión (ROI) del sistema de vigilancia de la CPA (~$20M USD anuales). ROI = (Costo Sin Detección - Costo Detección Ideal) / Costo de Vigilancia = ($55.25B - $1.20B) / $20M = 2,702. Por cada dólar invertido en vigilancia activa, México ahorra $2,700 dólares en mitigación de crisis.</w:t>
       </w:r>
     </w:p>
     <w:p>
@@ -11232,7 +11232,7 @@
           <w:sz w:val="22"/>
           <w:szCs w:val="22"/>
         </w:rPr>
-        <w:t xml:space="preserve">El cierre de exportaciones domina el costo en escenarios controlados: Incluso con detección en Día 3 (solo 16 animales), el cierre de exportaciones bovinas genera $1.20B en pérdidas. Este costo es inevitable una vez declarado I₀ = 1.</w:t>
+        <w:t xml:space="preserve">El cierre de exportaciones domina el costo en escenarios controlados: Incluso con detección en el Día 3, el costo del sacrificio es insignificante (16 * $1,544 = $24,704 USD), pero el costo por cierre de exportaciones es de $1.20B USD. El ratio de daño colateral es de 48,615x. El daño comercial colateral es casi 50 mil veces mayor que el daño biológico directo. Este costo es inevitable una vez declarado el caso I_0 = 1. La FMD es un virus económico.</w:t>
       </w:r>
     </w:p>
     <w:p>
@@ -11253,7 +11253,7 @@
           <w:sz w:val="22"/>
           <w:szCs w:val="22"/>
         </w:rPr>
-        <w:t xml:space="preserve">Proxy comparativo con TB Bovina: </w:t>
+        <w:t xml:space="preserve">Proxy comparativo con TB Bovina (7,089x): </w:t>
       </w:r>
       <w:r>
         <w:rPr>
@@ -11261,7 +11261,7 @@
           <w:sz w:val="22"/>
           <w:szCs w:val="22"/>
         </w:rPr>
-        <w:t xml:space="preserve">A modo de referencia, la TB Bovina (endémica, R₀ = 1.8) genera pérdidas de ~$7.8M USD en 12 meses sin detección. La FMD genera $55.3B USD en 5 meses — una diferencia de 7,000x.</w:t>
+        <w:t xml:space="preserve">Para validar el modelo, comparamos la FMD con la Tuberculosis Bovina (endémica). La TB (R_0 = 1.8) es de progresión lenta y genera pérdidas directas de ~$7.8M USD a 12 meses sin detección. La FMD (R_0 = 6.0) genera $55.3B USD en 5 meses. El ratio de severidad es de 55.3B / 7.8M = 7,089x. Esto valida que un modelo capaz de mapear la TB, es indispensable para la FMD.</w:t>
       </w:r>
     </w:p>
     <w:p>

</xml_diff>

<commit_message>
docs: standardize financial notation to 'Millones' (M) replacing ambiguous 'Billion' (B)
</commit_message>
<xml_diff>
--- a/docs/Segundo_avance/Ganado_Saludable_Segundo_Avance.docx
+++ b/docs/Segundo_avance/Ganado_Saludable_Segundo_Avance.docx
@@ -6271,7 +6271,7 @@
           <w:sz w:val="22"/>
           <w:szCs w:val="22"/>
         </w:rPr>
-        <w:t xml:space="preserve">En menos de 150 días, la pérdida acumulada alcanza $52.8 Billion USD, equivalente al 4% del PIB de México.</w:t>
+        <w:t xml:space="preserve">En menos de 150 días, la pérdida acumulada alcanza $52,800 Millones USD, equivalente al 4% del PIB de México.</w:t>
       </w:r>
     </w:p>
     <w:p>
@@ -6334,7 +6334,7 @@
           <w:sz w:val="18"/>
           <w:szCs w:val="18"/>
         </w:rPr>
-        <w:t xml:space="preserve">Figura 11. Colapso financiero catastrófico por Fiebre Aftosa ($52.8B USD en 150 días).</w:t>
+        <w:t xml:space="preserve">Figura 11. Colapso financiero catastrófico por Fiebre Aftosa ($52,800M USD en 150 días).</w:t>
       </w:r>
     </w:p>
     <w:p>
@@ -9953,7 +9953,7 @@
           <w:sz w:val="22"/>
           <w:szCs w:val="22"/>
         </w:rPr>
-        <w:t xml:space="preserve">Con R₀ = 6.0, la FMD no es lineal — es una detonación nuclear biológica. En el Mes 1 parece controlable (1,904 sacrificados), pero en el Mes 2 ya son 8.7 millones y en el Mes 3, 21.7 millones. El Mes 1 muestra un cierre de exportaciones menor ($217M vs $246M) debido al modelo escalonado. A 5 meses, la pérdida acumulada alcanza $52.8 Billion USD — equivalente al 4% del PIB de México.</w:t>
+        <w:t xml:space="preserve">Con R₀ = 6.0, la FMD no es lineal — es una detonación nuclear biológica. En el Mes 1 parece controlable (1,904 sacrificados), pero en el Mes 2 ya son 8.7 millones y en el Mes 3, 21.7 millones. El Mes 1 muestra un cierre de exportaciones menor ($217M vs $246M) debido al modelo escalonado. A 5 meses, la pérdida acumulada alcanza $52,800 Millones USD — equivalente al 4% del PIB de México.</w:t>
       </w:r>
     </w:p>
     <w:p>
@@ -9977,7 +9977,7 @@
           <w:sz w:val="22"/>
           <w:szCs w:val="22"/>
         </w:rPr>
-        <w:t xml:space="preserve">El brote de FMD en Reino Unido (2001) costó £8B (~$12B USD), con 6.5 millones de animales sacrificados y £1.3B en compensaciones directas (Anderson Report, 2002). México, con un hato 5.4x mayor, enfrentaría pérdidas proporcionalmente mayores.</w:t>
+        <w:t xml:space="preserve">El brote de FMD en Reino Unido (2001) costó £8,000M (~$12,000M USD), con 6.5 millones de animales sacrificados y £1,300M en compensaciones directas (Anderson Report, 2002). México, con un hato 5.4x mayor, enfrentaría pérdidas proporcionalmente mayores.</w:t>
       </w:r>
     </w:p>
     <w:p>
@@ -10533,7 +10533,7 @@
                 <w:sz w:val="20"/>
                 <w:szCs w:val="20"/>
               </w:rPr>
-              <w:t xml:space="preserve">$54.05B (97.8%)</w:t>
+              <w:t xml:space="preserve">$54,050M (97.8%)</w:t>
             </w:r>
           </w:p>
         </w:tc>
@@ -10731,7 +10731,7 @@
                 <w:sz w:val="20"/>
                 <w:szCs w:val="20"/>
               </w:rPr>
-              <w:t xml:space="preserve">$54.05B (97.8%)</w:t>
+              <w:t xml:space="preserve">$54,050M (97.8%)</w:t>
             </w:r>
           </w:p>
         </w:tc>
@@ -10929,7 +10929,7 @@
                 <w:sz w:val="20"/>
                 <w:szCs w:val="20"/>
               </w:rPr>
-              <w:t xml:space="preserve">$53.96B (97.7%)</w:t>
+              <w:t xml:space="preserve">$53,960M (97.7%)</w:t>
             </w:r>
           </w:p>
         </w:tc>
@@ -11213,7 +11213,7 @@
           <w:sz w:val="22"/>
           <w:szCs w:val="22"/>
         </w:rPr>
-        <w:t xml:space="preserve">El ROI de la vigilancia es astronómico (2,700:1): Calculamos el Retorno de Inversión (ROI) del sistema de vigilancia de la CPA (~$20M USD anuales). ROI = (Costo Sin Detección - Costo Detección Ideal) / Costo de Vigilancia = ($55.25B - $1.20B) / $20M = 2,702. Por cada dólar invertido en vigilancia activa, México ahorra $2,700 dólares en mitigación de crisis.</w:t>
+        <w:t xml:space="preserve">El ROI de la vigilancia es astronómico (2,700:1): Calculamos el Retorno de Inversión (ROI) del sistema de vigilancia de la CPA (~$20M USD anuales). ROI = (Costo Sin Detección - Costo Detección Ideal) / Costo de Vigilancia = ($55,250M - $1,200M) / $20M = 2,702. Por cada dólar invertido en vigilancia activa, México ahorra $2,700 dólares en mitigación de crisis.</w:t>
       </w:r>
     </w:p>
     <w:p>
@@ -11232,7 +11232,7 @@
           <w:sz w:val="22"/>
           <w:szCs w:val="22"/>
         </w:rPr>
-        <w:t xml:space="preserve">El cierre de exportaciones domina el costo en escenarios controlados: Incluso con detección en el Día 3, el costo del sacrificio es insignificante (16 * $1,544 = $24,704 USD), pero el costo por cierre de exportaciones es de $1.20B USD. El ratio de daño colateral es de 48,615x. El daño comercial colateral es casi 50 mil veces mayor que el daño biológico directo. Este costo es inevitable una vez declarado el caso I_0 = 1. La FMD es un virus económico.</w:t>
+        <w:t xml:space="preserve">El cierre de exportaciones domina el costo en escenarios controlados: Incluso con detección en el Día 3, el costo del sacrificio es insignificante (16 * $1,544 = $24,704 USD), pero el costo por cierre de exportaciones es de $1,200M USD. El ratio de daño colateral es de 48,615x. El daño comercial colateral es casi 50 mil veces mayor que el daño biológico directo. Este costo es inevitable una vez declarado el caso I_0 = 1. La FMD es un virus económico.</w:t>
       </w:r>
     </w:p>
     <w:p>
@@ -11261,7 +11261,7 @@
           <w:sz w:val="22"/>
           <w:szCs w:val="22"/>
         </w:rPr>
-        <w:t xml:space="preserve">Para validar el modelo, comparamos la FMD con la Tuberculosis Bovina (endémica). La TB (R_0 = 1.8) es de progresión lenta y genera pérdidas directas de ~$7.8M USD a 12 meses sin detección. La FMD (R_0 = 6.0) genera $55.3B USD en 5 meses. El ratio de severidad es de 55.3B / 7.8M = 7,089x. Esto valida que un modelo capaz de mapear la TB, es indispensable para la FMD.</w:t>
+        <w:t xml:space="preserve">Para validar el modelo, comparamos la FMD con la Tuberculosis Bovina (endémica). La TB (R_0 = 1.8) es de progresión lenta y genera pérdidas directas de ~$7.8M USD a 12 meses sin detección. La FMD (R_0 = 6.0) genera $55,300M USD en 5 meses. El ratio de severidad es de 55,300M / 7.8M = 7,089x. Esto valida que un modelo capaz de mapear la TB, es indispensable para la FMD.</w:t>
       </w:r>
     </w:p>
     <w:p>

</xml_diff>